<commit_message>
Refresh: docs/templates/Kitchen_Action_Items.docx (Aug 19, 2026)
</commit_message>
<xml_diff>
--- a/docs/templates/Kitchen_Action_Items.docx
+++ b/docs/templates/Kitchen_Action_Items.docx
@@ -45,7 +45,7 @@
           <w:sz w:val="17"/>
           <w:szCs w:val="17"/>
         </w:rPr>
-        <w:t>As of August 18, 2026  ·  Three-Pillar Retirement Strategy</w:t>
+        <w:t>As of August 19, 2026  ·  Three-Pillar Retirement Strategy</w:t>
       </w:r>
     </w:p>
     <w:p>
@@ -10185,14 +10185,18 @@
             <w:vAlign w:val="center"/>
           </w:tcPr>
           <w:p>
-            <w:r/>
+            <w:r>
+              <w:rPr>
+                <w:rFonts w:ascii="Calibri" w:hAnsi="Calibri"/>
+              </w:rPr>
+              <w:t>Income Summary — August 19, 2026</w:t>
+            </w:r>
             <w:r>
               <w:rPr>
                 <w:rFonts w:ascii="Calibri" w:hAnsi="Calibri" w:eastAsia="Calibri" w:cs="Calibri"/>
                 <w:b/>
                 <w:sz w:val="16"/>
               </w:rPr>
-              <w:t>Income Summary — August 18, 2026</w:t>
             </w:r>
           </w:p>
         </w:tc>
@@ -10334,14 +10338,18 @@
             <w:vAlign w:val="center"/>
           </w:tcPr>
           <w:p>
-            <w:r/>
+            <w:r>
+              <w:rPr>
+                <w:rFonts w:ascii="Calibri" w:hAnsi="Calibri"/>
+              </w:rPr>
+              <w:t>$82,162</w:t>
+            </w:r>
             <w:r>
               <w:rPr>
                 <w:rFonts w:ascii="Calibri" w:hAnsi="Calibri" w:eastAsia="Calibri" w:cs="Calibri"/>
                 <w:b/>
                 <w:sz w:val="18"/>
               </w:rPr>
-              <w:t>$82,164</w:t>
             </w:r>
           </w:p>
         </w:tc>
@@ -10357,14 +10365,18 @@
             <w:vAlign w:val="center"/>
           </w:tcPr>
           <w:p>
-            <w:r/>
+            <w:r>
+              <w:rPr>
+                <w:rFonts w:ascii="Calibri" w:hAnsi="Calibri"/>
+              </w:rPr>
+              <w:t>$6,847</w:t>
+            </w:r>
             <w:r>
               <w:rPr>
                 <w:rFonts w:ascii="Calibri" w:hAnsi="Calibri" w:eastAsia="Calibri" w:cs="Calibri"/>
                 <w:b/>
                 <w:sz w:val="18"/>
               </w:rPr>
-              <w:t>$6,847</w:t>
             </w:r>
           </w:p>
         </w:tc>
@@ -10570,14 +10582,18 @@
             <w:vAlign w:val="center"/>
           </w:tcPr>
           <w:p>
-            <w:r/>
+            <w:r>
+              <w:rPr>
+                <w:rFonts w:ascii="Calibri" w:hAnsi="Calibri"/>
+              </w:rPr>
+              <w:t>~$83,432</w:t>
+            </w:r>
             <w:r>
               <w:rPr>
                 <w:rFonts w:ascii="Calibri" w:hAnsi="Calibri" w:eastAsia="Calibri" w:cs="Calibri"/>
                 <w:b/>
                 <w:sz w:val="18"/>
               </w:rPr>
-              <w:t>~$83,434</w:t>
             </w:r>
           </w:p>
         </w:tc>
@@ -10616,14 +10632,18 @@
             <w:vAlign w:val="center"/>
           </w:tcPr>
           <w:p>
-            <w:r/>
+            <w:r>
+              <w:rPr>
+                <w:rFonts w:ascii="Calibri" w:hAnsi="Calibri"/>
+              </w:rPr>
+              <w:t>All-in income $91,994 exceeds target ✅</w:t>
+            </w:r>
             <w:r>
               <w:rPr>
                 <w:rFonts w:ascii="Calibri" w:hAnsi="Calibri" w:eastAsia="Calibri" w:cs="Calibri"/>
                 <w:b/>
                 <w:sz w:val="18"/>
               </w:rPr>
-              <w:t>All-in income $91,996 exceeds target ✅</w:t>
             </w:r>
           </w:p>
         </w:tc>

</xml_diff>

<commit_message>
Update docs/templates/Kitchen_Action_Items.docx to current Aug 21
</commit_message>
<xml_diff>
--- a/docs/templates/Kitchen_Action_Items.docx
+++ b/docs/templates/Kitchen_Action_Items.docx
@@ -45,7 +45,7 @@
           <w:sz w:val="17"/>
           <w:szCs w:val="17"/>
         </w:rPr>
-        <w:t>As of August 20, 2026  ·  Three-Pillar Retirement Strategy</w:t>
+        <w:t>As of August 21, 2026  ·  Three-Pillar Retirement Strategy</w:t>
       </w:r>
     </w:p>
     <w:p>
@@ -454,83 +454,115 @@
             <w:vAlign w:val="center"/>
           </w:tcPr>
           <w:p>
-            <w:r/>
-            <w:r>
-              <w:rPr>
-                <w:rFonts w:ascii="Calibri" w:hAnsi="Calibri" w:eastAsia="Calibri" w:cs="Calibri"/>
-                <w:b w:val="0"/>
-                <w:sz w:val="17"/>
-              </w:rPr>
-              <w:t>✅ Done</w:t>
-            </w:r>
-          </w:p>
-        </w:tc>
-        <w:tc>
-          <w:tcPr>
-            <w:tcBorders>
-              <w:top w:val="single" w:color="E2E4E9" w:sz="1"/>
-              <w:left w:val="none" w:color="FFFFFF" w:sz="0"/>
-              <w:bottom w:val="single" w:color="E2E4E9" w:sz="1"/>
-              <w:right w:val="none" w:color="FFFFFF" w:sz="0"/>
-            </w:tcBorders>
-            <w:shd w:fill="D4EDDA" w:val="clear"/>
-            <w:vAlign w:val="center"/>
-          </w:tcPr>
-          <w:p>
-            <w:r/>
-            <w:r>
-              <w:rPr>
-                <w:rFonts w:ascii="Calibri" w:hAnsi="Calibri" w:eastAsia="Calibri" w:cs="Calibri"/>
-                <w:b w:val="0"/>
-                <w:sz w:val="17"/>
-              </w:rPr>
-              <w:t>Added 12sh UTG → 410 → 422sh · CB $28.50</w:t>
-            </w:r>
-          </w:p>
-        </w:tc>
-        <w:tc>
-          <w:tcPr>
-            <w:tcBorders>
-              <w:top w:val="single" w:color="E2E4E9" w:sz="1"/>
-              <w:left w:val="none" w:color="FFFFFF" w:sz="0"/>
-              <w:bottom w:val="single" w:color="E2E4E9" w:sz="1"/>
-              <w:right w:val="none" w:color="FFFFFF" w:sz="0"/>
-            </w:tcBorders>
-            <w:shd w:fill="D4EDDA" w:val="clear"/>
-            <w:vAlign w:val="center"/>
-          </w:tcPr>
-          <w:p>
-            <w:r/>
-            <w:r>
-              <w:rPr>
-                <w:rFonts w:ascii="Calibri" w:hAnsi="Calibri" w:eastAsia="Calibri" w:cs="Calibri"/>
-                <w:b w:val="0"/>
-                <w:sz w:val="16"/>
-              </w:rPr>
-              <w:t>Brad Roth IRA</w:t>
-            </w:r>
-          </w:p>
-        </w:tc>
-        <w:tc>
-          <w:tcPr>
-            <w:tcBorders>
-              <w:top w:val="single" w:color="E2E4E9" w:sz="1"/>
-              <w:left w:val="none" w:color="FFFFFF" w:sz="0"/>
-              <w:bottom w:val="single" w:color="E2E4E9" w:sz="1"/>
-              <w:right w:val="none" w:color="FFFFFF" w:sz="0"/>
-            </w:tcBorders>
-            <w:shd w:fill="D4EDDA" w:val="clear"/>
-            <w:vAlign w:val="center"/>
-          </w:tcPr>
-          <w:p>
-            <w:r/>
-            <w:r>
-              <w:rPr>
-                <w:rFonts w:ascii="Calibri" w:hAnsi="Calibri" w:eastAsia="Calibri" w:cs="Calibri"/>
-                <w:b w:val="0"/>
-                <w:sz w:val="16"/>
-              </w:rPr>
-              <w:t>August 18, 2026</w:t>
+            <w:pPr>
+              <w:spacing w:after="40" w:before="40"/>
+              <w:jc w:val="left"/>
+            </w:pPr>
+            <w:r>
+              <w:rPr>
+                <w:rFonts w:ascii="Calibri" w:cs="Calibri" w:eastAsia="Calibri" w:hAnsi="Calibri"/>
+                <w:b/>
+                <w:bCs/>
+                <w:i w:val="false"/>
+                <w:iCs w:val="false"/>
+                <w:color w:val="155724"/>
+                <w:sz w:val="17"/>
+                <w:szCs w:val="17"/>
+              </w:rPr>
+              <w:t xml:space="preserve">✅ Done</w:t>
+            </w:r>
+          </w:p>
+        </w:tc>
+        <w:tc>
+          <w:tcPr>
+            <w:tcBorders>
+              <w:top w:val="single" w:color="E2E4E9" w:sz="1"/>
+              <w:left w:val="none" w:color="FFFFFF" w:sz="0"/>
+              <w:bottom w:val="single" w:color="E2E4E9" w:sz="1"/>
+              <w:right w:val="none" w:color="FFFFFF" w:sz="0"/>
+            </w:tcBorders>
+            <w:shd w:fill="D4EDDA" w:val="clear"/>
+            <w:vAlign w:val="center"/>
+          </w:tcPr>
+          <w:p>
+            <w:pPr>
+              <w:spacing w:after="40" w:before="40"/>
+              <w:jc w:val="left"/>
+            </w:pPr>
+            <w:r>
+              <w:rPr>
+                <w:rFonts w:ascii="Calibri" w:cs="Calibri" w:eastAsia="Calibri" w:hAnsi="Calibri"/>
+                <w:b w:val="false"/>
+                <w:bCs w:val="false"/>
+                <w:i w:val="false"/>
+                <w:iCs w:val="false"/>
+                <w:color w:val="1F3864"/>
+                <w:sz w:val="17"/>
+                <w:szCs w:val="17"/>
+              </w:rPr>
+              <w:t>Added 200sh PTY → 1,900 → 2,600sh</w:t>
+            </w:r>
+          </w:p>
+        </w:tc>
+        <w:tc>
+          <w:tcPr>
+            <w:tcBorders>
+              <w:top w:val="single" w:color="E2E4E9" w:sz="1"/>
+              <w:left w:val="none" w:color="FFFFFF" w:sz="0"/>
+              <w:bottom w:val="single" w:color="E2E4E9" w:sz="1"/>
+              <w:right w:val="none" w:color="FFFFFF" w:sz="0"/>
+            </w:tcBorders>
+            <w:shd w:fill="D4EDDA" w:val="clear"/>
+            <w:vAlign w:val="center"/>
+          </w:tcPr>
+          <w:p>
+            <w:pPr>
+              <w:spacing w:after="40" w:before="40"/>
+              <w:jc w:val="left"/>
+            </w:pPr>
+            <w:r>
+              <w:rPr>
+                <w:rFonts w:ascii="Calibri" w:cs="Calibri" w:eastAsia="Calibri" w:hAnsi="Calibri"/>
+                <w:b w:val="false"/>
+                <w:bCs w:val="false"/>
+                <w:i/>
+                <w:iCs/>
+                <w:color w:val="5A5E6B"/>
+                <w:sz w:val="16"/>
+                <w:szCs w:val="16"/>
+              </w:rPr>
+              <w:t xml:space="preserve">Brad IRA</w:t>
+            </w:r>
+          </w:p>
+        </w:tc>
+        <w:tc>
+          <w:tcPr>
+            <w:tcBorders>
+              <w:top w:val="single" w:color="E2E4E9" w:sz="1"/>
+              <w:left w:val="none" w:color="FFFFFF" w:sz="0"/>
+              <w:bottom w:val="single" w:color="E2E4E9" w:sz="1"/>
+              <w:right w:val="none" w:color="FFFFFF" w:sz="0"/>
+            </w:tcBorders>
+            <w:shd w:fill="D4EDDA" w:val="clear"/>
+            <w:vAlign w:val="center"/>
+          </w:tcPr>
+          <w:p>
+            <w:pPr>
+              <w:spacing w:after="40" w:before="40"/>
+              <w:jc w:val="left"/>
+            </w:pPr>
+            <w:r>
+              <w:rPr>
+                <w:rFonts w:ascii="Calibri" w:cs="Calibri" w:eastAsia="Calibri" w:hAnsi="Calibri"/>
+                <w:b w:val="false"/>
+                <w:bCs w:val="false"/>
+                <w:i w:val="false"/>
+                <w:iCs w:val="false"/>
+                <w:color w:val="5A5E6B"/>
+                <w:sz w:val="16"/>
+                <w:szCs w:val="16"/>
+              </w:rPr>
+              <w:t>June 17, 2026</w:t>
             </w:r>
           </w:p>
         </w:tc>
@@ -594,7 +626,7 @@
                 <w:sz w:val="17"/>
                 <w:szCs w:val="17"/>
               </w:rPr>
-              <w:t>Added 200sh PTY → 1,900 → 2,600sh</w:t>
+              <w:t>Added 20sh SCHD → 3,170 → 3,190sh (Lisa IRA)</w:t>
             </w:r>
           </w:p>
         </w:tc>
@@ -720,7 +752,7 @@
                 <w:sz w:val="17"/>
                 <w:szCs w:val="17"/>
               </w:rPr>
-              <w:t xml:space="preserve">Added 100sh DFP → 1,000 → 1,100sh</w:t>
+              <w:t>Added 10sh EPD → 375 → 385sh (Joint)</w:t>
             </w:r>
           </w:p>
         </w:tc>
@@ -751,7 +783,7 @@
                 <w:sz w:val="16"/>
                 <w:szCs w:val="16"/>
               </w:rPr>
-              <w:t xml:space="preserve">Lisa IRA</w:t>
+              <w:t xml:space="preserve">Brad IRA</w:t>
             </w:r>
           </w:p>
         </w:tc>
@@ -846,7 +878,7 @@
                 <w:sz w:val="17"/>
                 <w:szCs w:val="17"/>
               </w:rPr>
-              <w:t xml:space="preserve">Added 10sh BTO → 425 → 435sh</w:t>
+              <w:t>Added 13sh UTG → 410 → 423sh (Brad Roth, incl +1 Aug 21)</w:t>
             </w:r>
           </w:p>
         </w:tc>
@@ -877,7 +909,7 @@
                 <w:sz w:val="16"/>
                 <w:szCs w:val="16"/>
               </w:rPr>
-              <w:t xml:space="preserve">Brad Roth IRA</w:t>
+              <w:t xml:space="preserve">Brad IRA</w:t>
             </w:r>
           </w:p>
         </w:tc>
@@ -972,7 +1004,7 @@
                 <w:sz w:val="17"/>
                 <w:szCs w:val="17"/>
               </w:rPr>
-              <w:t xml:space="preserve">Added 125sh JPC → 2,400 → 2,525sh</w:t>
+              <w:t xml:space="preserve">Added 100sh DFP → 1,000 → 1,100sh</w:t>
             </w:r>
           </w:p>
         </w:tc>
@@ -1003,7 +1035,7 @@
                 <w:sz w:val="16"/>
                 <w:szCs w:val="16"/>
               </w:rPr>
-              <w:t xml:space="preserve">Brad Roth IRA</w:t>
+              <w:t xml:space="preserve">Lisa IRA</w:t>
             </w:r>
           </w:p>
         </w:tc>
@@ -1098,7 +1130,7 @@
                 <w:sz w:val="17"/>
                 <w:szCs w:val="17"/>
               </w:rPr>
-              <w:t>Added 10sh PDI → 850 → 890sh (Lisa HSA)</w:t>
+              <w:t xml:space="preserve">Added 10sh BTO → 425 → 435sh</w:t>
             </w:r>
           </w:p>
         </w:tc>
@@ -1129,7 +1161,7 @@
                 <w:sz w:val="16"/>
                 <w:szCs w:val="16"/>
               </w:rPr>
-              <w:t xml:space="preserve">Lisa HSA</w:t>
+              <w:t xml:space="preserve">Brad Roth IRA</w:t>
             </w:r>
           </w:p>
         </w:tc>
@@ -1224,7 +1256,7 @@
                 <w:sz w:val="17"/>
                 <w:szCs w:val="17"/>
               </w:rPr>
-              <w:t xml:space="preserve">Added 300sh SCHD → 2,530 → 2,955sh total</w:t>
+              <w:t xml:space="preserve">Added 125sh JPC → 2,400 → 2,525sh</w:t>
             </w:r>
           </w:p>
         </w:tc>
@@ -1255,7 +1287,7 @@
                 <w:sz w:val="16"/>
                 <w:szCs w:val="16"/>
               </w:rPr>
-              <w:t xml:space="preserve">Lisa IRA</w:t>
+              <w:t xml:space="preserve">Brad Roth IRA</w:t>
             </w:r>
           </w:p>
         </w:tc>
@@ -1350,7 +1382,7 @@
                 <w:sz w:val="17"/>
                 <w:szCs w:val="17"/>
               </w:rPr>
-              <w:t>Added 110sh O → 1,460 → 1,590sh total</w:t>
+              <w:t>Added 10sh PDI → 850 → 890sh (Lisa HSA)</w:t>
             </w:r>
           </w:p>
         </w:tc>
@@ -1381,7 +1413,7 @@
                 <w:sz w:val="16"/>
                 <w:szCs w:val="16"/>
               </w:rPr>
-              <w:t xml:space="preserve">Brad IRA</w:t>
+              <w:t xml:space="preserve">Lisa HSA</w:t>
             </w:r>
           </w:p>
         </w:tc>
@@ -1476,7 +1508,7 @@
                 <w:sz w:val="17"/>
                 <w:szCs w:val="17"/>
               </w:rPr>
-              <w:t>Added 100sh PTY → 2,000 → 2,100 → 2,600sh</w:t>
+              <w:t xml:space="preserve">Added 300sh SCHD → 2,530 → 2,955sh total</w:t>
             </w:r>
           </w:p>
         </w:tc>
@@ -1507,7 +1539,7 @@
                 <w:sz w:val="16"/>
                 <w:szCs w:val="16"/>
               </w:rPr>
-              <w:t xml:space="preserve">Brad IRA</w:t>
+              <w:t xml:space="preserve">Lisa IRA</w:t>
             </w:r>
           </w:p>
         </w:tc>
@@ -1602,7 +1634,7 @@
                 <w:sz w:val="17"/>
                 <w:szCs w:val="17"/>
               </w:rPr>
-              <w:t>Added 14sh BTO → 435 → 467sh</w:t>
+              <w:t>Added 110sh O → 1,460 → 1,590sh total</w:t>
             </w:r>
           </w:p>
         </w:tc>
@@ -1633,7 +1665,7 @@
                 <w:sz w:val="16"/>
                 <w:szCs w:val="16"/>
               </w:rPr>
-              <w:t xml:space="preserve">Brad Roth IRA</w:t>
+              <w:t xml:space="preserve">Brad IRA</w:t>
             </w:r>
           </w:p>
         </w:tc>
@@ -1728,7 +1760,7 @@
                 <w:sz w:val="17"/>
                 <w:szCs w:val="17"/>
               </w:rPr>
-              <w:t>Added 35sh SCHD → 2,920 → 2,955sh</w:t>
+              <w:t>Added 100sh PTY → 2,000 → 2,100 → 2,600sh</w:t>
             </w:r>
           </w:p>
         </w:tc>
@@ -1759,7 +1791,7 @@
                 <w:sz w:val="16"/>
                 <w:szCs w:val="16"/>
               </w:rPr>
-              <w:t xml:space="preserve">Lisa IRA</w:t>
+              <w:t xml:space="preserve">Brad IRA</w:t>
             </w:r>
           </w:p>
         </w:tc>
@@ -1854,7 +1886,7 @@
                 <w:sz w:val="17"/>
                 <w:szCs w:val="17"/>
               </w:rPr>
-              <w:t>Added 6sh BTO → 461 → 467sh</w:t>
+              <w:t>Added 14sh BTO → 435 → 467sh</w:t>
             </w:r>
           </w:p>
         </w:tc>
@@ -1980,7 +2012,7 @@
                 <w:sz w:val="17"/>
                 <w:szCs w:val="17"/>
               </w:rPr>
-              <w:t>Added 16sh AGNC → 1,394 → 1,410sh</w:t>
+              <w:t>Added 35sh SCHD → 2,920 → 2,955sh</w:t>
             </w:r>
           </w:p>
         </w:tc>
@@ -2011,7 +2043,7 @@
                 <w:sz w:val="16"/>
                 <w:szCs w:val="16"/>
               </w:rPr>
-              <w:t xml:space="preserve">Brad Roth IRA</w:t>
+              <w:t xml:space="preserve">Lisa IRA</w:t>
             </w:r>
           </w:p>
         </w:tc>
@@ -2106,7 +2138,7 @@
                 <w:sz w:val="17"/>
                 <w:szCs w:val="17"/>
               </w:rPr>
-              <w:t>Added 10sh O → 1,590 → 1,600sh · CB $58.38</w:t>
+              <w:t>Added 6sh BTO → 461 → 467sh</w:t>
             </w:r>
           </w:p>
         </w:tc>
@@ -2137,7 +2169,7 @@
                 <w:sz w:val="16"/>
                 <w:szCs w:val="16"/>
               </w:rPr>
-              <w:t xml:space="preserve">Brad IRA</w:t>
+              <w:t xml:space="preserve">Brad Roth IRA</w:t>
             </w:r>
           </w:p>
         </w:tc>
@@ -2232,7 +2264,7 @@
                 <w:sz w:val="17"/>
                 <w:szCs w:val="17"/>
               </w:rPr>
-              <w:t>Added 143sh JPC → 2,525 → 2,668sh · CB $7.88</w:t>
+              <w:t>Added 16sh AGNC → 1,394 → 1,410sh</w:t>
             </w:r>
           </w:p>
         </w:tc>
@@ -2358,7 +2390,7 @@
                 <w:sz w:val="17"/>
                 <w:szCs w:val="17"/>
               </w:rPr>
-              <w:t>Added ~15.5sh EPD → 330 → 345.5sh · CB $30.13</w:t>
+              <w:t>Added 10sh O → 1,590 → 1,600sh · CB $58.38</w:t>
             </w:r>
           </w:p>
         </w:tc>
@@ -2389,7 +2421,7 @@
                 <w:sz w:val="16"/>
                 <w:szCs w:val="16"/>
               </w:rPr>
-              <w:t xml:space="preserve">Joint</w:t>
+              <w:t xml:space="preserve">Brad IRA</w:t>
             </w:r>
           </w:p>
         </w:tc>
@@ -2484,7 +2516,7 @@
                 <w:sz w:val="17"/>
                 <w:szCs w:val="17"/>
               </w:rPr>
-              <w:t>Added 10sh EPD → 345.5 → 355.5sh · CB $30.30</w:t>
+              <w:t>Added 143sh JPC → 2,525 → 2,668sh · CB $7.88</w:t>
             </w:r>
           </w:p>
         </w:tc>
@@ -2515,7 +2547,7 @@
                 <w:sz w:val="16"/>
                 <w:szCs w:val="16"/>
               </w:rPr>
-              <w:t xml:space="preserve">Joint</w:t>
+              <w:t xml:space="preserve">Brad Roth IRA</w:t>
             </w:r>
           </w:p>
         </w:tc>
@@ -2610,7 +2642,7 @@
                 <w:sz w:val="17"/>
                 <w:szCs w:val="17"/>
               </w:rPr>
-              <w:t>Added 1sh TPL → 9 → 10sh · CB $405.80</w:t>
+              <w:t>Added ~15.5sh EPD → 330 → 345.5sh · CB $30.13</w:t>
             </w:r>
           </w:p>
         </w:tc>
@@ -2736,7 +2768,7 @@
                 <w:sz w:val="17"/>
                 <w:szCs w:val="17"/>
               </w:rPr>
-              <w:t>Added 30sh SCHD → 2,955 → 2,985sh · CB $26.40</w:t>
+              <w:t>Added 10sh EPD → 345.5 → 355.5sh · CB $30.30</w:t>
             </w:r>
           </w:p>
         </w:tc>
@@ -2767,38 +2799,38 @@
                 <w:sz w:val="16"/>
                 <w:szCs w:val="16"/>
               </w:rPr>
-              <w:t xml:space="preserve">Lisa IRA</w:t>
-            </w:r>
-          </w:p>
-        </w:tc>
-        <w:tc>
-          <w:tcPr>
-            <w:tcBorders>
-              <w:top w:val="single" w:color="E2E4E9" w:sz="1"/>
-              <w:left w:val="none" w:color="FFFFFF" w:sz="0"/>
-              <w:bottom w:val="single" w:color="E2E4E9" w:sz="1"/>
-              <w:right w:val="none" w:color="FFFFFF" w:sz="0"/>
-            </w:tcBorders>
-            <w:shd w:fill="D4EDDA" w:val="clear"/>
-            <w:vAlign w:val="center"/>
-          </w:tcPr>
-          <w:p>
-            <w:pPr>
-              <w:spacing w:after="40" w:before="40"/>
-              <w:jc w:val="left"/>
-            </w:pPr>
-            <w:r>
-              <w:rPr>
-                <w:rFonts w:ascii="Calibri" w:cs="Calibri" w:eastAsia="Calibri" w:hAnsi="Calibri"/>
-                <w:b w:val="false"/>
-                <w:bCs w:val="false"/>
-                <w:i w:val="false"/>
-                <w:iCs w:val="false"/>
-                <w:color w:val="5A5E6B"/>
-                <w:sz w:val="16"/>
-                <w:szCs w:val="16"/>
-              </w:rPr>
-              <w:t>August 14, 2026</w:t>
+              <w:t xml:space="preserve">Joint</w:t>
+            </w:r>
+          </w:p>
+        </w:tc>
+        <w:tc>
+          <w:tcPr>
+            <w:tcBorders>
+              <w:top w:val="single" w:color="E2E4E9" w:sz="1"/>
+              <w:left w:val="none" w:color="FFFFFF" w:sz="0"/>
+              <w:bottom w:val="single" w:color="E2E4E9" w:sz="1"/>
+              <w:right w:val="none" w:color="FFFFFF" w:sz="0"/>
+            </w:tcBorders>
+            <w:shd w:fill="D4EDDA" w:val="clear"/>
+            <w:vAlign w:val="center"/>
+          </w:tcPr>
+          <w:p>
+            <w:pPr>
+              <w:spacing w:after="40" w:before="40"/>
+              <w:jc w:val="left"/>
+            </w:pPr>
+            <w:r>
+              <w:rPr>
+                <w:rFonts w:ascii="Calibri" w:cs="Calibri" w:eastAsia="Calibri" w:hAnsi="Calibri"/>
+                <w:b w:val="false"/>
+                <w:bCs w:val="false"/>
+                <w:i w:val="false"/>
+                <w:iCs w:val="false"/>
+                <w:color w:val="5A5E6B"/>
+                <w:sz w:val="16"/>
+                <w:szCs w:val="16"/>
+              </w:rPr>
+              <w:t>June 17, 2026</w:t>
             </w:r>
           </w:p>
         </w:tc>
@@ -2862,7 +2894,7 @@
                 <w:sz w:val="17"/>
                 <w:szCs w:val="17"/>
               </w:rPr>
-              <w:t>Added 35sh SCHD → 2,985 → 3,020sh · CB $26.46</w:t>
+              <w:t>Added 1sh TPL → 9 → 10sh · CB $405.80</w:t>
             </w:r>
           </w:p>
         </w:tc>
@@ -2893,38 +2925,38 @@
                 <w:sz w:val="16"/>
                 <w:szCs w:val="16"/>
               </w:rPr>
-              <w:t xml:space="preserve">Lisa IRA</w:t>
-            </w:r>
-          </w:p>
-        </w:tc>
-        <w:tc>
-          <w:tcPr>
-            <w:tcBorders>
-              <w:top w:val="single" w:color="E2E4E9" w:sz="1"/>
-              <w:left w:val="none" w:color="FFFFFF" w:sz="0"/>
-              <w:bottom w:val="single" w:color="E2E4E9" w:sz="1"/>
-              <w:right w:val="none" w:color="FFFFFF" w:sz="0"/>
-            </w:tcBorders>
-            <w:shd w:fill="D4EDDA" w:val="clear"/>
-            <w:vAlign w:val="center"/>
-          </w:tcPr>
-          <w:p>
-            <w:pPr>
-              <w:spacing w:after="40" w:before="40"/>
-              <w:jc w:val="left"/>
-            </w:pPr>
-            <w:r>
-              <w:rPr>
-                <w:rFonts w:ascii="Calibri" w:cs="Calibri" w:eastAsia="Calibri" w:hAnsi="Calibri"/>
-                <w:b w:val="false"/>
-                <w:bCs w:val="false"/>
-                <w:i w:val="false"/>
-                <w:iCs w:val="false"/>
-                <w:color w:val="5A5E6B"/>
-                <w:sz w:val="16"/>
-                <w:szCs w:val="16"/>
-              </w:rPr>
-              <w:t>August 14, 2026</w:t>
+              <w:t xml:space="preserve">Joint</w:t>
+            </w:r>
+          </w:p>
+        </w:tc>
+        <w:tc>
+          <w:tcPr>
+            <w:tcBorders>
+              <w:top w:val="single" w:color="E2E4E9" w:sz="1"/>
+              <w:left w:val="none" w:color="FFFFFF" w:sz="0"/>
+              <w:bottom w:val="single" w:color="E2E4E9" w:sz="1"/>
+              <w:right w:val="none" w:color="FFFFFF" w:sz="0"/>
+            </w:tcBorders>
+            <w:shd w:fill="D4EDDA" w:val="clear"/>
+            <w:vAlign w:val="center"/>
+          </w:tcPr>
+          <w:p>
+            <w:pPr>
+              <w:spacing w:after="40" w:before="40"/>
+              <w:jc w:val="left"/>
+            </w:pPr>
+            <w:r>
+              <w:rPr>
+                <w:rFonts w:ascii="Calibri" w:cs="Calibri" w:eastAsia="Calibri" w:hAnsi="Calibri"/>
+                <w:b w:val="false"/>
+                <w:bCs w:val="false"/>
+                <w:i w:val="false"/>
+                <w:iCs w:val="false"/>
+                <w:color w:val="5A5E6B"/>
+                <w:sz w:val="16"/>
+                <w:szCs w:val="16"/>
+              </w:rPr>
+              <w:t>June 17, 2026</w:t>
             </w:r>
           </w:p>
         </w:tc>
@@ -2988,7 +3020,7 @@
                 <w:sz w:val="17"/>
                 <w:szCs w:val="17"/>
               </w:rPr>
-              <w:t>Added 50sh SCHD → 3,045 → 3,095sh · CB $26.59</w:t>
+              <w:t>Added 30sh SCHD → 2,955 → 2,985sh · CB $26.40</w:t>
             </w:r>
           </w:p>
         </w:tc>
@@ -3050,7 +3082,7 @@
                 <w:sz w:val="16"/>
                 <w:szCs w:val="16"/>
               </w:rPr>
-              <w:t>June 30, 2026</w:t>
+              <w:t>August 21, 2026</w:t>
             </w:r>
           </w:p>
         </w:tc>
@@ -3114,7 +3146,7 @@
                 <w:sz w:val="17"/>
                 <w:szCs w:val="17"/>
               </w:rPr>
-              <w:t>Added 25sh SCHD → 3,095 → 3,120sh · CB $26.63</w:t>
+              <w:t>Added 35sh SCHD → 2,985 → 3,020sh · CB $26.46</w:t>
             </w:r>
           </w:p>
         </w:tc>
@@ -3176,7 +3208,7 @@
                 <w:sz w:val="16"/>
                 <w:szCs w:val="16"/>
               </w:rPr>
-              <w:t>August 14, 2026</w:t>
+              <w:t>August 21, 2026</w:t>
             </w:r>
           </w:p>
         </w:tc>
@@ -3240,7 +3272,7 @@
                 <w:sz w:val="17"/>
                 <w:szCs w:val="17"/>
               </w:rPr>
-              <w:t>Added 20sh AMLP → 490 → 510sh · CB $48.64</w:t>
+              <w:t>Added 50sh SCHD → 3,045 → 3,095sh · CB $26.59</w:t>
             </w:r>
           </w:p>
         </w:tc>
@@ -3271,38 +3303,38 @@
                 <w:sz w:val="16"/>
                 <w:szCs w:val="16"/>
               </w:rPr>
-              <w:t xml:space="preserve">Brad Roth IRA</w:t>
-            </w:r>
-          </w:p>
-        </w:tc>
-        <w:tc>
-          <w:tcPr>
-            <w:tcBorders>
-              <w:top w:val="single" w:color="E2E4E9" w:sz="1"/>
-              <w:left w:val="none" w:color="FFFFFF" w:sz="0"/>
-              <w:bottom w:val="single" w:color="E2E4E9" w:sz="1"/>
-              <w:right w:val="none" w:color="FFFFFF" w:sz="0"/>
-            </w:tcBorders>
-            <w:shd w:fill="D4EDDA" w:val="clear"/>
-            <w:vAlign w:val="center"/>
-          </w:tcPr>
-          <w:p>
-            <w:pPr>
-              <w:spacing w:after="40" w:before="40"/>
-              <w:jc w:val="left"/>
-            </w:pPr>
-            <w:r>
-              <w:rPr>
-                <w:rFonts w:ascii="Calibri" w:cs="Calibri" w:eastAsia="Calibri" w:hAnsi="Calibri"/>
-                <w:b w:val="false"/>
-                <w:bCs w:val="false"/>
-                <w:i w:val="false"/>
-                <w:iCs w:val="false"/>
-                <w:color w:val="5A5E6B"/>
-                <w:sz w:val="16"/>
-                <w:szCs w:val="16"/>
-              </w:rPr>
-              <w:t>August 14, 2026</w:t>
+              <w:t xml:space="preserve">Lisa IRA</w:t>
+            </w:r>
+          </w:p>
+        </w:tc>
+        <w:tc>
+          <w:tcPr>
+            <w:tcBorders>
+              <w:top w:val="single" w:color="E2E4E9" w:sz="1"/>
+              <w:left w:val="none" w:color="FFFFFF" w:sz="0"/>
+              <w:bottom w:val="single" w:color="E2E4E9" w:sz="1"/>
+              <w:right w:val="none" w:color="FFFFFF" w:sz="0"/>
+            </w:tcBorders>
+            <w:shd w:fill="D4EDDA" w:val="clear"/>
+            <w:vAlign w:val="center"/>
+          </w:tcPr>
+          <w:p>
+            <w:pPr>
+              <w:spacing w:after="40" w:before="40"/>
+              <w:jc w:val="left"/>
+            </w:pPr>
+            <w:r>
+              <w:rPr>
+                <w:rFonts w:ascii="Calibri" w:cs="Calibri" w:eastAsia="Calibri" w:hAnsi="Calibri"/>
+                <w:b w:val="false"/>
+                <w:bCs w:val="false"/>
+                <w:i w:val="false"/>
+                <w:iCs w:val="false"/>
+                <w:color w:val="5A5E6B"/>
+                <w:sz w:val="16"/>
+                <w:szCs w:val="16"/>
+              </w:rPr>
+              <w:t>June 30, 2026</w:t>
             </w:r>
           </w:p>
         </w:tc>
@@ -3366,7 +3398,7 @@
                 <w:sz w:val="17"/>
                 <w:szCs w:val="17"/>
               </w:rPr>
-              <w:t>Added 200sh THW → NEW → 200sh · CB $13.25</w:t>
+              <w:t>Added 25sh SCHD → 3,095 → 3,120sh · CB $26.63</w:t>
             </w:r>
           </w:p>
         </w:tc>
@@ -3428,7 +3460,7 @@
                 <w:sz w:val="16"/>
                 <w:szCs w:val="16"/>
               </w:rPr>
-              <w:t>August 14, 2026</w:t>
+              <w:t>August 21, 2026</w:t>
             </w:r>
           </w:p>
         </w:tc>
@@ -3492,7 +3524,7 @@
                 <w:sz w:val="17"/>
                 <w:szCs w:val="17"/>
               </w:rPr>
-              <w:t>Added 20sh AMLP → 510 → 530sh · CB $48.82</w:t>
+              <w:t>Added 20sh AMLP → 490 → 510sh · CB $48.64</w:t>
             </w:r>
           </w:p>
         </w:tc>
@@ -3554,7 +3586,7 @@
                 <w:sz w:val="16"/>
                 <w:szCs w:val="16"/>
               </w:rPr>
-              <w:t>August 14, 2026</w:t>
+              <w:t>August 21, 2026</w:t>
             </w:r>
           </w:p>
         </w:tc>
@@ -3618,7 +3650,7 @@
                 <w:sz w:val="17"/>
                 <w:szCs w:val="17"/>
               </w:rPr>
-              <w:t>Added 37sh JPC → 2,668 → 2,705sh · CB $7.88</w:t>
+              <w:t>Added 200sh THW → NEW → 200sh · CB $13.25</w:t>
             </w:r>
           </w:p>
         </w:tc>
@@ -3649,38 +3681,38 @@
                 <w:sz w:val="16"/>
                 <w:szCs w:val="16"/>
               </w:rPr>
-              <w:t xml:space="preserve">Brad Roth IRA</w:t>
-            </w:r>
-          </w:p>
-        </w:tc>
-        <w:tc>
-          <w:tcPr>
-            <w:tcBorders>
-              <w:top w:val="single" w:color="E2E4E9" w:sz="1"/>
-              <w:left w:val="none" w:color="FFFFFF" w:sz="0"/>
-              <w:bottom w:val="single" w:color="E2E4E9" w:sz="1"/>
-              <w:right w:val="none" w:color="FFFFFF" w:sz="0"/>
-            </w:tcBorders>
-            <w:shd w:fill="D4EDDA" w:val="clear"/>
-            <w:vAlign w:val="center"/>
-          </w:tcPr>
-          <w:p>
-            <w:pPr>
-              <w:spacing w:after="40" w:before="40"/>
-              <w:jc w:val="left"/>
-            </w:pPr>
-            <w:r>
-              <w:rPr>
-                <w:rFonts w:ascii="Calibri" w:cs="Calibri" w:eastAsia="Calibri" w:hAnsi="Calibri"/>
-                <w:b w:val="false"/>
-                <w:bCs w:val="false"/>
-                <w:i w:val="false"/>
-                <w:iCs w:val="false"/>
-                <w:color w:val="5A5E6B"/>
-                <w:sz w:val="16"/>
-                <w:szCs w:val="16"/>
-              </w:rPr>
-              <w:t>August 14, 2026</w:t>
+              <w:t xml:space="preserve">Lisa IRA</w:t>
+            </w:r>
+          </w:p>
+        </w:tc>
+        <w:tc>
+          <w:tcPr>
+            <w:tcBorders>
+              <w:top w:val="single" w:color="E2E4E9" w:sz="1"/>
+              <w:left w:val="none" w:color="FFFFFF" w:sz="0"/>
+              <w:bottom w:val="single" w:color="E2E4E9" w:sz="1"/>
+              <w:right w:val="none" w:color="FFFFFF" w:sz="0"/>
+            </w:tcBorders>
+            <w:shd w:fill="D4EDDA" w:val="clear"/>
+            <w:vAlign w:val="center"/>
+          </w:tcPr>
+          <w:p>
+            <w:pPr>
+              <w:spacing w:after="40" w:before="40"/>
+              <w:jc w:val="left"/>
+            </w:pPr>
+            <w:r>
+              <w:rPr>
+                <w:rFonts w:ascii="Calibri" w:cs="Calibri" w:eastAsia="Calibri" w:hAnsi="Calibri"/>
+                <w:b w:val="false"/>
+                <w:bCs w:val="false"/>
+                <w:i w:val="false"/>
+                <w:iCs w:val="false"/>
+                <w:color w:val="5A5E6B"/>
+                <w:sz w:val="16"/>
+                <w:szCs w:val="16"/>
+              </w:rPr>
+              <w:t>August 21, 2026</w:t>
             </w:r>
           </w:p>
         </w:tc>
@@ -3744,7 +3776,7 @@
                 <w:sz w:val="17"/>
                 <w:szCs w:val="17"/>
               </w:rPr>
-              <w:t>Added 20sh SCHD → 3,120 → 3,140sh · CB $26.67</w:t>
+              <w:t>Added 20sh AMLP → 510 → 530sh · CB $48.82</w:t>
             </w:r>
           </w:p>
         </w:tc>
@@ -3775,38 +3807,38 @@
                 <w:sz w:val="16"/>
                 <w:szCs w:val="16"/>
               </w:rPr>
-              <w:t xml:space="preserve">Lisa IRA</w:t>
-            </w:r>
-          </w:p>
-        </w:tc>
-        <w:tc>
-          <w:tcPr>
-            <w:tcBorders>
-              <w:top w:val="single" w:color="E2E4E9" w:sz="1"/>
-              <w:left w:val="none" w:color="FFFFFF" w:sz="0"/>
-              <w:bottom w:val="single" w:color="E2E4E9" w:sz="1"/>
-              <w:right w:val="none" w:color="FFFFFF" w:sz="0"/>
-            </w:tcBorders>
-            <w:shd w:fill="D4EDDA" w:val="clear"/>
-            <w:vAlign w:val="center"/>
-          </w:tcPr>
-          <w:p>
-            <w:pPr>
-              <w:spacing w:after="40" w:before="40"/>
-              <w:jc w:val="left"/>
-            </w:pPr>
-            <w:r>
-              <w:rPr>
-                <w:rFonts w:ascii="Calibri" w:cs="Calibri" w:eastAsia="Calibri" w:hAnsi="Calibri"/>
-                <w:b w:val="false"/>
-                <w:bCs w:val="false"/>
-                <w:i w:val="false"/>
-                <w:iCs w:val="false"/>
-                <w:color w:val="5A5E6B"/>
-                <w:sz w:val="16"/>
-                <w:szCs w:val="16"/>
-              </w:rPr>
-              <w:t>August 14, 2026</w:t>
+              <w:t xml:space="preserve">Brad Roth IRA</w:t>
+            </w:r>
+          </w:p>
+        </w:tc>
+        <w:tc>
+          <w:tcPr>
+            <w:tcBorders>
+              <w:top w:val="single" w:color="E2E4E9" w:sz="1"/>
+              <w:left w:val="none" w:color="FFFFFF" w:sz="0"/>
+              <w:bottom w:val="single" w:color="E2E4E9" w:sz="1"/>
+              <w:right w:val="none" w:color="FFFFFF" w:sz="0"/>
+            </w:tcBorders>
+            <w:shd w:fill="D4EDDA" w:val="clear"/>
+            <w:vAlign w:val="center"/>
+          </w:tcPr>
+          <w:p>
+            <w:pPr>
+              <w:spacing w:after="40" w:before="40"/>
+              <w:jc w:val="left"/>
+            </w:pPr>
+            <w:r>
+              <w:rPr>
+                <w:rFonts w:ascii="Calibri" w:cs="Calibri" w:eastAsia="Calibri" w:hAnsi="Calibri"/>
+                <w:b w:val="false"/>
+                <w:bCs w:val="false"/>
+                <w:i w:val="false"/>
+                <w:iCs w:val="false"/>
+                <w:color w:val="5A5E6B"/>
+                <w:sz w:val="16"/>
+                <w:szCs w:val="16"/>
+              </w:rPr>
+              <w:t>August 21, 2026</w:t>
             </w:r>
           </w:p>
         </w:tc>
@@ -3870,7 +3902,7 @@
                 <w:sz w:val="17"/>
                 <w:szCs w:val="17"/>
               </w:rPr>
-              <w:t>Added 200sh THW → 200 → 400sh · CB $13.18</w:t>
+              <w:t>Added 37sh JPC → 2,668 → 2,705sh · CB $7.88</w:t>
             </w:r>
           </w:p>
         </w:tc>
@@ -3901,38 +3933,38 @@
                 <w:sz w:val="16"/>
                 <w:szCs w:val="16"/>
               </w:rPr>
-              <w:t xml:space="preserve">Lisa IRA</w:t>
-            </w:r>
-          </w:p>
-        </w:tc>
-        <w:tc>
-          <w:tcPr>
-            <w:tcBorders>
-              <w:top w:val="single" w:color="E2E4E9" w:sz="1"/>
-              <w:left w:val="none" w:color="FFFFFF" w:sz="0"/>
-              <w:bottom w:val="single" w:color="E2E4E9" w:sz="1"/>
-              <w:right w:val="none" w:color="FFFFFF" w:sz="0"/>
-            </w:tcBorders>
-            <w:shd w:fill="D4EDDA" w:val="clear"/>
-            <w:vAlign w:val="center"/>
-          </w:tcPr>
-          <w:p>
-            <w:pPr>
-              <w:spacing w:after="40" w:before="40"/>
-              <w:jc w:val="left"/>
-            </w:pPr>
-            <w:r>
-              <w:rPr>
-                <w:rFonts w:ascii="Calibri" w:cs="Calibri" w:eastAsia="Calibri" w:hAnsi="Calibri"/>
-                <w:b w:val="false"/>
-                <w:bCs w:val="false"/>
-                <w:i w:val="false"/>
-                <w:iCs w:val="false"/>
-                <w:color w:val="5A5E6B"/>
-                <w:sz w:val="16"/>
-                <w:szCs w:val="16"/>
-              </w:rPr>
-              <w:t>August 14, 2026</w:t>
+              <w:t xml:space="preserve">Brad Roth IRA</w:t>
+            </w:r>
+          </w:p>
+        </w:tc>
+        <w:tc>
+          <w:tcPr>
+            <w:tcBorders>
+              <w:top w:val="single" w:color="E2E4E9" w:sz="1"/>
+              <w:left w:val="none" w:color="FFFFFF" w:sz="0"/>
+              <w:bottom w:val="single" w:color="E2E4E9" w:sz="1"/>
+              <w:right w:val="none" w:color="FFFFFF" w:sz="0"/>
+            </w:tcBorders>
+            <w:shd w:fill="D4EDDA" w:val="clear"/>
+            <w:vAlign w:val="center"/>
+          </w:tcPr>
+          <w:p>
+            <w:pPr>
+              <w:spacing w:after="40" w:before="40"/>
+              <w:jc w:val="left"/>
+            </w:pPr>
+            <w:r>
+              <w:rPr>
+                <w:rFonts w:ascii="Calibri" w:cs="Calibri" w:eastAsia="Calibri" w:hAnsi="Calibri"/>
+                <w:b w:val="false"/>
+                <w:bCs w:val="false"/>
+                <w:i w:val="false"/>
+                <w:iCs w:val="false"/>
+                <w:color w:val="5A5E6B"/>
+                <w:sz w:val="16"/>
+                <w:szCs w:val="16"/>
+              </w:rPr>
+              <w:t>August 21, 2026</w:t>
             </w:r>
           </w:p>
         </w:tc>
@@ -3996,7 +4028,7 @@
                 <w:sz w:val="17"/>
                 <w:szCs w:val="17"/>
               </w:rPr>
-              <w:t>Added 100sh THW → 400 → 500sh · CB $13.19</w:t>
+              <w:t>Added 20sh SCHD → 3,120 → 3,140sh · CB $26.67</w:t>
             </w:r>
           </w:p>
         </w:tc>
@@ -4058,7 +4090,7 @@
                 <w:sz w:val="16"/>
                 <w:szCs w:val="16"/>
               </w:rPr>
-              <w:t>August 14, 2026</w:t>
+              <w:t>August 21, 2026</w:t>
             </w:r>
           </w:p>
         </w:tc>
@@ -4122,7 +4154,7 @@
                 <w:sz w:val="17"/>
                 <w:szCs w:val="17"/>
               </w:rPr>
-              <w:t>Added 35sh AGNC → 1,435 → 1,470sh · CB $11.90</w:t>
+              <w:t>Added 200sh THW → 200 → 400sh · CB $13.18</w:t>
             </w:r>
           </w:p>
         </w:tc>
@@ -4153,38 +4185,38 @@
                 <w:sz w:val="16"/>
                 <w:szCs w:val="16"/>
               </w:rPr>
-              <w:t xml:space="preserve">Brad Roth IRA</w:t>
-            </w:r>
-          </w:p>
-        </w:tc>
-        <w:tc>
-          <w:tcPr>
-            <w:tcBorders>
-              <w:top w:val="single" w:color="E2E4E9" w:sz="1"/>
-              <w:left w:val="none" w:color="FFFFFF" w:sz="0"/>
-              <w:bottom w:val="single" w:color="E2E4E9" w:sz="1"/>
-              <w:right w:val="none" w:color="FFFFFF" w:sz="0"/>
-            </w:tcBorders>
-            <w:shd w:fill="D4EDDA" w:val="clear"/>
-            <w:vAlign w:val="center"/>
-          </w:tcPr>
-          <w:p>
-            <w:pPr>
-              <w:spacing w:after="40" w:before="40"/>
-              <w:jc w:val="left"/>
-            </w:pPr>
-            <w:r>
-              <w:rPr>
-                <w:rFonts w:ascii="Calibri" w:cs="Calibri" w:eastAsia="Calibri" w:hAnsi="Calibri"/>
-                <w:b w:val="false"/>
-                <w:bCs w:val="false"/>
-                <w:i w:val="false"/>
-                <w:iCs w:val="false"/>
-                <w:color w:val="5A5E6B"/>
-                <w:sz w:val="16"/>
-                <w:szCs w:val="16"/>
-              </w:rPr>
-              <w:t>August 14, 2026</w:t>
+              <w:t xml:space="preserve">Lisa IRA</w:t>
+            </w:r>
+          </w:p>
+        </w:tc>
+        <w:tc>
+          <w:tcPr>
+            <w:tcBorders>
+              <w:top w:val="single" w:color="E2E4E9" w:sz="1"/>
+              <w:left w:val="none" w:color="FFFFFF" w:sz="0"/>
+              <w:bottom w:val="single" w:color="E2E4E9" w:sz="1"/>
+              <w:right w:val="none" w:color="FFFFFF" w:sz="0"/>
+            </w:tcBorders>
+            <w:shd w:fill="D4EDDA" w:val="clear"/>
+            <w:vAlign w:val="center"/>
+          </w:tcPr>
+          <w:p>
+            <w:pPr>
+              <w:spacing w:after="40" w:before="40"/>
+              <w:jc w:val="left"/>
+            </w:pPr>
+            <w:r>
+              <w:rPr>
+                <w:rFonts w:ascii="Calibri" w:cs="Calibri" w:eastAsia="Calibri" w:hAnsi="Calibri"/>
+                <w:b w:val="false"/>
+                <w:bCs w:val="false"/>
+                <w:i w:val="false"/>
+                <w:iCs w:val="false"/>
+                <w:color w:val="5A5E6B"/>
+                <w:sz w:val="16"/>
+                <w:szCs w:val="16"/>
+              </w:rPr>
+              <w:t>August 21, 2026</w:t>
             </w:r>
           </w:p>
         </w:tc>
@@ -4248,7 +4280,7 @@
                 <w:sz w:val="17"/>
                 <w:szCs w:val="17"/>
               </w:rPr>
-              <w:t>Added 17sh AGNC → 1,470 → 1,487sh · CB $11.89</w:t>
+              <w:t>Added 100sh THW → 400 → 500sh · CB $13.19</w:t>
             </w:r>
           </w:p>
         </w:tc>
@@ -4279,38 +4311,38 @@
                 <w:sz w:val="16"/>
                 <w:szCs w:val="16"/>
               </w:rPr>
-              <w:t xml:space="preserve">Brad Roth IRA</w:t>
-            </w:r>
-          </w:p>
-        </w:tc>
-        <w:tc>
-          <w:tcPr>
-            <w:tcBorders>
-              <w:top w:val="single" w:color="E2E4E9" w:sz="1"/>
-              <w:left w:val="none" w:color="FFFFFF" w:sz="0"/>
-              <w:bottom w:val="single" w:color="E2E4E9" w:sz="1"/>
-              <w:right w:val="none" w:color="FFFFFF" w:sz="0"/>
-            </w:tcBorders>
-            <w:shd w:fill="D4EDDA" w:val="clear"/>
-            <w:vAlign w:val="center"/>
-          </w:tcPr>
-          <w:p>
-            <w:pPr>
-              <w:spacing w:after="40" w:before="40"/>
-              <w:jc w:val="left"/>
-            </w:pPr>
-            <w:r>
-              <w:rPr>
-                <w:rFonts w:ascii="Calibri" w:cs="Calibri" w:eastAsia="Calibri" w:hAnsi="Calibri"/>
-                <w:b w:val="false"/>
-                <w:bCs w:val="false"/>
-                <w:i w:val="false"/>
-                <w:iCs w:val="false"/>
-                <w:color w:val="5A5E6B"/>
-                <w:sz w:val="16"/>
-                <w:szCs w:val="16"/>
-              </w:rPr>
-              <w:t>August 14, 2026</w:t>
+              <w:t xml:space="preserve">Lisa IRA</w:t>
+            </w:r>
+          </w:p>
+        </w:tc>
+        <w:tc>
+          <w:tcPr>
+            <w:tcBorders>
+              <w:top w:val="single" w:color="E2E4E9" w:sz="1"/>
+              <w:left w:val="none" w:color="FFFFFF" w:sz="0"/>
+              <w:bottom w:val="single" w:color="E2E4E9" w:sz="1"/>
+              <w:right w:val="none" w:color="FFFFFF" w:sz="0"/>
+            </w:tcBorders>
+            <w:shd w:fill="D4EDDA" w:val="clear"/>
+            <w:vAlign w:val="center"/>
+          </w:tcPr>
+          <w:p>
+            <w:pPr>
+              <w:spacing w:after="40" w:before="40"/>
+              <w:jc w:val="left"/>
+            </w:pPr>
+            <w:r>
+              <w:rPr>
+                <w:rFonts w:ascii="Calibri" w:cs="Calibri" w:eastAsia="Calibri" w:hAnsi="Calibri"/>
+                <w:b w:val="false"/>
+                <w:bCs w:val="false"/>
+                <w:i w:val="false"/>
+                <w:iCs w:val="false"/>
+                <w:color w:val="5A5E6B"/>
+                <w:sz w:val="16"/>
+                <w:szCs w:val="16"/>
+              </w:rPr>
+              <w:t>August 21, 2026</w:t>
             </w:r>
           </w:p>
         </w:tc>
@@ -4374,7 +4406,7 @@
                 <w:sz w:val="17"/>
                 <w:szCs w:val="17"/>
               </w:rPr>
-              <w:t>Added 30sh SCHD → 3,140 → 3,170sh · CB $26.74</w:t>
+              <w:t>Added 35sh AGNC → 1,435 → 1,470sh · CB $11.90</w:t>
             </w:r>
           </w:p>
         </w:tc>
@@ -4436,7 +4468,7 @@
                 <w:sz w:val="16"/>
                 <w:szCs w:val="16"/>
               </w:rPr>
-              <w:t>August 14, 2026</w:t>
+              <w:t>August 21, 2026</w:t>
             </w:r>
           </w:p>
         </w:tc>
@@ -4500,7 +4532,7 @@
                 <w:sz w:val="17"/>
                 <w:szCs w:val="17"/>
               </w:rPr>
-              <w:t>Added 5sh EPD → 370 → 375sh · CB $30.69</w:t>
+              <w:t>Added 17sh AGNC → 1,470 → 1,487sh · CB $11.89</w:t>
             </w:r>
           </w:p>
         </w:tc>
@@ -4562,7 +4594,7 @@
                 <w:sz w:val="16"/>
                 <w:szCs w:val="16"/>
               </w:rPr>
-              <w:t>August 14, 2026</w:t>
+              <w:t>August 21, 2026</w:t>
             </w:r>
           </w:p>
         </w:tc>
@@ -4626,7 +4658,7 @@
                 <w:sz w:val="17"/>
                 <w:szCs w:val="17"/>
               </w:rPr>
-              <w:t>Added 1sh TPL → 10 → 11sh · CB $399.82</w:t>
+              <w:t>Added 30sh SCHD → 3,140 → 3,170sh · CB $26.74</w:t>
             </w:r>
           </w:p>
         </w:tc>
@@ -4688,7 +4720,7 @@
                 <w:sz w:val="16"/>
                 <w:szCs w:val="16"/>
               </w:rPr>
-              <w:t>August 14, 2026</w:t>
+              <w:t>August 21, 2026</w:t>
             </w:r>
           </w:p>
         </w:tc>
@@ -4752,7 +4784,7 @@
                 <w:sz w:val="17"/>
                 <w:szCs w:val="17"/>
               </w:rPr>
-              <w:t>Sold 5sh ORCL → 100 → 95sh @ $153 (planned trim)</w:t>
+              <w:t>Added 5sh EPD → 370 → 375sh · CB $30.69</w:t>
             </w:r>
           </w:p>
         </w:tc>
@@ -4814,7 +4846,7 @@
                 <w:sz w:val="16"/>
                 <w:szCs w:val="16"/>
               </w:rPr>
-              <w:t>August 14, 2026</w:t>
+              <w:t>August 21, 2026</w:t>
             </w:r>
           </w:p>
         </w:tc>
@@ -4878,7 +4910,7 @@
                 <w:sz w:val="17"/>
                 <w:szCs w:val="17"/>
               </w:rPr>
-              <w:t>Added 23sh BTO → 467 → 490sh · CB $37.10</w:t>
+              <w:t>Added 1sh TPL → 10 → 11sh · CB $399.82</w:t>
             </w:r>
           </w:p>
         </w:tc>
@@ -4940,7 +4972,7 @@
                 <w:sz w:val="16"/>
                 <w:szCs w:val="16"/>
               </w:rPr>
-              <w:t>August 14, 2026</w:t>
+              <w:t>August 21, 2026</w:t>
             </w:r>
           </w:p>
         </w:tc>
@@ -5004,7 +5036,7 @@
                 <w:sz w:val="17"/>
                 <w:szCs w:val="17"/>
               </w:rPr>
-              <w:t>Added 9sh JEPQ → 218 → 227sh · CB $58.92</w:t>
+              <w:t>Sold 5sh ORCL → 100 → 95sh @ $153 (planned trim)</w:t>
             </w:r>
           </w:p>
         </w:tc>
@@ -5035,38 +5067,38 @@
                 <w:sz w:val="16"/>
                 <w:szCs w:val="16"/>
               </w:rPr>
-              <w:t xml:space="preserve">Lisa HSA</w:t>
-            </w:r>
-          </w:p>
-        </w:tc>
-        <w:tc>
-          <w:tcPr>
-            <w:tcBorders>
-              <w:top w:val="single" w:color="E2E4E9" w:sz="1"/>
-              <w:left w:val="none" w:color="FFFFFF" w:sz="0"/>
-              <w:bottom w:val="single" w:color="E2E4E9" w:sz="1"/>
-              <w:right w:val="none" w:color="FFFFFF" w:sz="0"/>
-            </w:tcBorders>
-            <w:shd w:fill="D4EDDA" w:val="clear"/>
-            <w:vAlign w:val="center"/>
-          </w:tcPr>
-          <w:p>
-            <w:pPr>
-              <w:spacing w:after="40" w:before="40"/>
-              <w:jc w:val="left"/>
-            </w:pPr>
-            <w:r>
-              <w:rPr>
-                <w:rFonts w:ascii="Calibri" w:cs="Calibri" w:eastAsia="Calibri" w:hAnsi="Calibri"/>
-                <w:b w:val="false"/>
-                <w:bCs w:val="false"/>
-                <w:i w:val="false"/>
-                <w:iCs w:val="false"/>
-                <w:color w:val="5A5E6B"/>
-                <w:sz w:val="16"/>
-                <w:szCs w:val="16"/>
-              </w:rPr>
-              <w:t>August 14, 2026</w:t>
+              <w:t xml:space="preserve">Brad Roth IRA</w:t>
+            </w:r>
+          </w:p>
+        </w:tc>
+        <w:tc>
+          <w:tcPr>
+            <w:tcBorders>
+              <w:top w:val="single" w:color="E2E4E9" w:sz="1"/>
+              <w:left w:val="none" w:color="FFFFFF" w:sz="0"/>
+              <w:bottom w:val="single" w:color="E2E4E9" w:sz="1"/>
+              <w:right w:val="none" w:color="FFFFFF" w:sz="0"/>
+            </w:tcBorders>
+            <w:shd w:fill="D4EDDA" w:val="clear"/>
+            <w:vAlign w:val="center"/>
+          </w:tcPr>
+          <w:p>
+            <w:pPr>
+              <w:spacing w:after="40" w:before="40"/>
+              <w:jc w:val="left"/>
+            </w:pPr>
+            <w:r>
+              <w:rPr>
+                <w:rFonts w:ascii="Calibri" w:cs="Calibri" w:eastAsia="Calibri" w:hAnsi="Calibri"/>
+                <w:b w:val="false"/>
+                <w:bCs w:val="false"/>
+                <w:i w:val="false"/>
+                <w:iCs w:val="false"/>
+                <w:color w:val="5A5E6B"/>
+                <w:sz w:val="16"/>
+                <w:szCs w:val="16"/>
+              </w:rPr>
+              <w:t>August 21, 2026</w:t>
             </w:r>
           </w:p>
         </w:tc>
@@ -5130,7 +5162,7 @@
                 <w:sz w:val="17"/>
                 <w:szCs w:val="17"/>
               </w:rPr>
-              <w:t>Added 5sh PDI → 342 → 347sh · CB $18.10</w:t>
+              <w:t>Added 23sh BTO → 467 → 490sh · CB $37.10</w:t>
             </w:r>
           </w:p>
         </w:tc>
@@ -5161,38 +5193,38 @@
                 <w:sz w:val="16"/>
                 <w:szCs w:val="16"/>
               </w:rPr>
-              <w:t xml:space="preserve">Brad HSA</w:t>
-            </w:r>
-          </w:p>
-        </w:tc>
-        <w:tc>
-          <w:tcPr>
-            <w:tcBorders>
-              <w:top w:val="single" w:color="E2E4E9" w:sz="1"/>
-              <w:left w:val="none" w:color="FFFFFF" w:sz="0"/>
-              <w:bottom w:val="single" w:color="E2E4E9" w:sz="1"/>
-              <w:right w:val="none" w:color="FFFFFF" w:sz="0"/>
-            </w:tcBorders>
-            <w:shd w:fill="D4EDDA" w:val="clear"/>
-            <w:vAlign w:val="center"/>
-          </w:tcPr>
-          <w:p>
-            <w:pPr>
-              <w:spacing w:after="40" w:before="40"/>
-              <w:jc w:val="left"/>
-            </w:pPr>
-            <w:r>
-              <w:rPr>
-                <w:rFonts w:ascii="Calibri" w:cs="Calibri" w:eastAsia="Calibri" w:hAnsi="Calibri"/>
-                <w:b w:val="false"/>
-                <w:bCs w:val="false"/>
-                <w:i w:val="false"/>
-                <w:iCs w:val="false"/>
-                <w:color w:val="5A5E6B"/>
-                <w:sz w:val="16"/>
-                <w:szCs w:val="16"/>
-              </w:rPr>
-              <w:t>August 14, 2026</w:t>
+              <w:t xml:space="preserve">Brad Roth IRA</w:t>
+            </w:r>
+          </w:p>
+        </w:tc>
+        <w:tc>
+          <w:tcPr>
+            <w:tcBorders>
+              <w:top w:val="single" w:color="E2E4E9" w:sz="1"/>
+              <w:left w:val="none" w:color="FFFFFF" w:sz="0"/>
+              <w:bottom w:val="single" w:color="E2E4E9" w:sz="1"/>
+              <w:right w:val="none" w:color="FFFFFF" w:sz="0"/>
+            </w:tcBorders>
+            <w:shd w:fill="D4EDDA" w:val="clear"/>
+            <w:vAlign w:val="center"/>
+          </w:tcPr>
+          <w:p>
+            <w:pPr>
+              <w:spacing w:after="40" w:before="40"/>
+              <w:jc w:val="left"/>
+            </w:pPr>
+            <w:r>
+              <w:rPr>
+                <w:rFonts w:ascii="Calibri" w:cs="Calibri" w:eastAsia="Calibri" w:hAnsi="Calibri"/>
+                <w:b w:val="false"/>
+                <w:bCs w:val="false"/>
+                <w:i w:val="false"/>
+                <w:iCs w:val="false"/>
+                <w:color w:val="5A5E6B"/>
+                <w:sz w:val="16"/>
+                <w:szCs w:val="16"/>
+              </w:rPr>
+              <w:t>August 21, 2026</w:t>
             </w:r>
           </w:p>
         </w:tc>
@@ -5256,7 +5288,7 @@
                 <w:sz w:val="17"/>
                 <w:szCs w:val="17"/>
               </w:rPr>
-              <w:t>Added 4.4sh EPD → 365.6 → 370sh · CB $30.59</w:t>
+              <w:t>Added 9sh JEPQ → 218 → 227sh · CB $58.92</w:t>
             </w:r>
           </w:p>
         </w:tc>
@@ -5287,38 +5319,38 @@
                 <w:sz w:val="16"/>
                 <w:szCs w:val="16"/>
               </w:rPr>
-              <w:t xml:space="preserve">Joint</w:t>
-            </w:r>
-          </w:p>
-        </w:tc>
-        <w:tc>
-          <w:tcPr>
-            <w:tcBorders>
-              <w:top w:val="single" w:color="E2E4E9" w:sz="1"/>
-              <w:left w:val="none" w:color="FFFFFF" w:sz="0"/>
-              <w:bottom w:val="single" w:color="E2E4E9" w:sz="1"/>
-              <w:right w:val="none" w:color="FFFFFF" w:sz="0"/>
-            </w:tcBorders>
-            <w:shd w:fill="D4EDDA" w:val="clear"/>
-            <w:vAlign w:val="center"/>
-          </w:tcPr>
-          <w:p>
-            <w:pPr>
-              <w:spacing w:after="40" w:before="40"/>
-              <w:jc w:val="left"/>
-            </w:pPr>
-            <w:r>
-              <w:rPr>
-                <w:rFonts w:ascii="Calibri" w:cs="Calibri" w:eastAsia="Calibri" w:hAnsi="Calibri"/>
-                <w:b w:val="false"/>
-                <w:bCs w:val="false"/>
-                <w:i w:val="false"/>
-                <w:iCs w:val="false"/>
-                <w:color w:val="5A5E6B"/>
-                <w:sz w:val="16"/>
-                <w:szCs w:val="16"/>
-              </w:rPr>
-              <w:t>August 14, 2026</w:t>
+              <w:t xml:space="preserve">Lisa HSA</w:t>
+            </w:r>
+          </w:p>
+        </w:tc>
+        <w:tc>
+          <w:tcPr>
+            <w:tcBorders>
+              <w:top w:val="single" w:color="E2E4E9" w:sz="1"/>
+              <w:left w:val="none" w:color="FFFFFF" w:sz="0"/>
+              <w:bottom w:val="single" w:color="E2E4E9" w:sz="1"/>
+              <w:right w:val="none" w:color="FFFFFF" w:sz="0"/>
+            </w:tcBorders>
+            <w:shd w:fill="D4EDDA" w:val="clear"/>
+            <w:vAlign w:val="center"/>
+          </w:tcPr>
+          <w:p>
+            <w:pPr>
+              <w:spacing w:after="40" w:before="40"/>
+              <w:jc w:val="left"/>
+            </w:pPr>
+            <w:r>
+              <w:rPr>
+                <w:rFonts w:ascii="Calibri" w:cs="Calibri" w:eastAsia="Calibri" w:hAnsi="Calibri"/>
+                <w:b w:val="false"/>
+                <w:bCs w:val="false"/>
+                <w:i w:val="false"/>
+                <w:iCs w:val="false"/>
+                <w:color w:val="5A5E6B"/>
+                <w:sz w:val="16"/>
+                <w:szCs w:val="16"/>
+              </w:rPr>
+              <w:t>August 21, 2026</w:t>
             </w:r>
           </w:p>
         </w:tc>
@@ -5382,7 +5414,7 @@
                 <w:sz w:val="17"/>
                 <w:szCs w:val="17"/>
               </w:rPr>
-              <w:t>Added 10sh EPD → 355.6 → 365.6sh · CB $30.51</w:t>
+              <w:t>Added 5sh PDI → 342 → 347sh · CB $18.10</w:t>
             </w:r>
           </w:p>
         </w:tc>
@@ -5413,38 +5445,38 @@
                 <w:sz w:val="16"/>
                 <w:szCs w:val="16"/>
               </w:rPr>
-              <w:t xml:space="preserve">Joint</w:t>
-            </w:r>
-          </w:p>
-        </w:tc>
-        <w:tc>
-          <w:tcPr>
-            <w:tcBorders>
-              <w:top w:val="single" w:color="E2E4E9" w:sz="1"/>
-              <w:left w:val="none" w:color="FFFFFF" w:sz="0"/>
-              <w:bottom w:val="single" w:color="E2E4E9" w:sz="1"/>
-              <w:right w:val="none" w:color="FFFFFF" w:sz="0"/>
-            </w:tcBorders>
-            <w:shd w:fill="D4EDDA" w:val="clear"/>
-            <w:vAlign w:val="center"/>
-          </w:tcPr>
-          <w:p>
-            <w:pPr>
-              <w:spacing w:after="40" w:before="40"/>
-              <w:jc w:val="left"/>
-            </w:pPr>
-            <w:r>
-              <w:rPr>
-                <w:rFonts w:ascii="Calibri" w:cs="Calibri" w:eastAsia="Calibri" w:hAnsi="Calibri"/>
-                <w:b w:val="false"/>
-                <w:bCs w:val="false"/>
-                <w:i w:val="false"/>
-                <w:iCs w:val="false"/>
-                <w:color w:val="5A5E6B"/>
-                <w:sz w:val="16"/>
-                <w:szCs w:val="16"/>
-              </w:rPr>
-              <w:t>August 14, 2026</w:t>
+              <w:t xml:space="preserve">Brad HSA</w:t>
+            </w:r>
+          </w:p>
+        </w:tc>
+        <w:tc>
+          <w:tcPr>
+            <w:tcBorders>
+              <w:top w:val="single" w:color="E2E4E9" w:sz="1"/>
+              <w:left w:val="none" w:color="FFFFFF" w:sz="0"/>
+              <w:bottom w:val="single" w:color="E2E4E9" w:sz="1"/>
+              <w:right w:val="none" w:color="FFFFFF" w:sz="0"/>
+            </w:tcBorders>
+            <w:shd w:fill="D4EDDA" w:val="clear"/>
+            <w:vAlign w:val="center"/>
+          </w:tcPr>
+          <w:p>
+            <w:pPr>
+              <w:spacing w:after="40" w:before="40"/>
+              <w:jc w:val="left"/>
+            </w:pPr>
+            <w:r>
+              <w:rPr>
+                <w:rFonts w:ascii="Calibri" w:cs="Calibri" w:eastAsia="Calibri" w:hAnsi="Calibri"/>
+                <w:b w:val="false"/>
+                <w:bCs w:val="false"/>
+                <w:i w:val="false"/>
+                <w:iCs w:val="false"/>
+                <w:color w:val="5A5E6B"/>
+                <w:sz w:val="16"/>
+                <w:szCs w:val="16"/>
+              </w:rPr>
+              <w:t>August 21, 2026</w:t>
             </w:r>
           </w:p>
         </w:tc>
@@ -5508,7 +5540,7 @@
                 <w:sz w:val="17"/>
                 <w:szCs w:val="17"/>
               </w:rPr>
-              <w:t>Added 25sh AGNC → 1,410 → 1435sh · CB $11.93</w:t>
+              <w:t>Added 4.4sh EPD → 365.6 → 370sh · CB $30.59</w:t>
             </w:r>
           </w:p>
         </w:tc>
@@ -5539,38 +5571,38 @@
                 <w:sz w:val="16"/>
                 <w:szCs w:val="16"/>
               </w:rPr>
-              <w:t xml:space="preserve">Brad Roth IRA</w:t>
-            </w:r>
-          </w:p>
-        </w:tc>
-        <w:tc>
-          <w:tcPr>
-            <w:tcBorders>
-              <w:top w:val="single" w:color="E2E4E9" w:sz="1"/>
-              <w:left w:val="none" w:color="FFFFFF" w:sz="0"/>
-              <w:bottom w:val="single" w:color="E2E4E9" w:sz="1"/>
-              <w:right w:val="none" w:color="FFFFFF" w:sz="0"/>
-            </w:tcBorders>
-            <w:shd w:fill="D4EDDA" w:val="clear"/>
-            <w:vAlign w:val="center"/>
-          </w:tcPr>
-          <w:p>
-            <w:pPr>
-              <w:spacing w:after="40" w:before="40"/>
-              <w:jc w:val="left"/>
-            </w:pPr>
-            <w:r>
-              <w:rPr>
-                <w:rFonts w:ascii="Calibri" w:cs="Calibri" w:eastAsia="Calibri" w:hAnsi="Calibri"/>
-                <w:b w:val="false"/>
-                <w:bCs w:val="false"/>
-                <w:i w:val="false"/>
-                <w:iCs w:val="false"/>
-                <w:color w:val="5A5E6B"/>
-                <w:sz w:val="16"/>
-                <w:szCs w:val="16"/>
-              </w:rPr>
-              <w:t>August 14, 2026</w:t>
+              <w:t xml:space="preserve">Joint</w:t>
+            </w:r>
+          </w:p>
+        </w:tc>
+        <w:tc>
+          <w:tcPr>
+            <w:tcBorders>
+              <w:top w:val="single" w:color="E2E4E9" w:sz="1"/>
+              <w:left w:val="none" w:color="FFFFFF" w:sz="0"/>
+              <w:bottom w:val="single" w:color="E2E4E9" w:sz="1"/>
+              <w:right w:val="none" w:color="FFFFFF" w:sz="0"/>
+            </w:tcBorders>
+            <w:shd w:fill="D4EDDA" w:val="clear"/>
+            <w:vAlign w:val="center"/>
+          </w:tcPr>
+          <w:p>
+            <w:pPr>
+              <w:spacing w:after="40" w:before="40"/>
+              <w:jc w:val="left"/>
+            </w:pPr>
+            <w:r>
+              <w:rPr>
+                <w:rFonts w:ascii="Calibri" w:cs="Calibri" w:eastAsia="Calibri" w:hAnsi="Calibri"/>
+                <w:b w:val="false"/>
+                <w:bCs w:val="false"/>
+                <w:i w:val="false"/>
+                <w:iCs w:val="false"/>
+                <w:color w:val="5A5E6B"/>
+                <w:sz w:val="16"/>
+                <w:szCs w:val="16"/>
+              </w:rPr>
+              <w:t>August 21, 2026</w:t>
             </w:r>
           </w:p>
         </w:tc>
@@ -5634,7 +5666,7 @@
                 <w:sz w:val="17"/>
                 <w:szCs w:val="17"/>
               </w:rPr>
-              <w:t>Opened 75sh BCX (NEW) · CB $11.67 ⚠ auto-added</w:t>
+              <w:t>Added 10sh EPD → 355.6 → 365.6sh · CB $30.51</w:t>
             </w:r>
           </w:p>
         </w:tc>
@@ -5665,38 +5697,38 @@
                 <w:sz w:val="16"/>
                 <w:szCs w:val="16"/>
               </w:rPr>
-              <w:t xml:space="preserve">Lisa IRA</w:t>
-            </w:r>
-          </w:p>
-        </w:tc>
-        <w:tc>
-          <w:tcPr>
-            <w:tcBorders>
-              <w:top w:val="single" w:color="E2E4E9" w:sz="1"/>
-              <w:left w:val="none" w:color="FFFFFF" w:sz="0"/>
-              <w:bottom w:val="single" w:color="E2E4E9" w:sz="1"/>
-              <w:right w:val="none" w:color="FFFFFF" w:sz="0"/>
-            </w:tcBorders>
-            <w:shd w:fill="D4EDDA" w:val="clear"/>
-            <w:vAlign w:val="center"/>
-          </w:tcPr>
-          <w:p>
-            <w:pPr>
-              <w:spacing w:after="40" w:before="40"/>
-              <w:jc w:val="left"/>
-            </w:pPr>
-            <w:r>
-              <w:rPr>
-                <w:rFonts w:ascii="Calibri" w:cs="Calibri" w:eastAsia="Calibri" w:hAnsi="Calibri"/>
-                <w:b w:val="false"/>
-                <w:bCs w:val="false"/>
-                <w:i w:val="false"/>
-                <w:iCs w:val="false"/>
-                <w:color w:val="5A5E6B"/>
-                <w:sz w:val="16"/>
-                <w:szCs w:val="16"/>
-              </w:rPr>
-              <w:t>August 14, 2026</w:t>
+              <w:t xml:space="preserve">Joint</w:t>
+            </w:r>
+          </w:p>
+        </w:tc>
+        <w:tc>
+          <w:tcPr>
+            <w:tcBorders>
+              <w:top w:val="single" w:color="E2E4E9" w:sz="1"/>
+              <w:left w:val="none" w:color="FFFFFF" w:sz="0"/>
+              <w:bottom w:val="single" w:color="E2E4E9" w:sz="1"/>
+              <w:right w:val="none" w:color="FFFFFF" w:sz="0"/>
+            </w:tcBorders>
+            <w:shd w:fill="D4EDDA" w:val="clear"/>
+            <w:vAlign w:val="center"/>
+          </w:tcPr>
+          <w:p>
+            <w:pPr>
+              <w:spacing w:after="40" w:before="40"/>
+              <w:jc w:val="left"/>
+            </w:pPr>
+            <w:r>
+              <w:rPr>
+                <w:rFonts w:ascii="Calibri" w:cs="Calibri" w:eastAsia="Calibri" w:hAnsi="Calibri"/>
+                <w:b w:val="false"/>
+                <w:bCs w:val="false"/>
+                <w:i w:val="false"/>
+                <w:iCs w:val="false"/>
+                <w:color w:val="5A5E6B"/>
+                <w:sz w:val="16"/>
+                <w:szCs w:val="16"/>
+              </w:rPr>
+              <w:t>August 21, 2026</w:t>
             </w:r>
           </w:p>
         </w:tc>
@@ -5760,7 +5792,7 @@
                 <w:sz w:val="17"/>
                 <w:szCs w:val="17"/>
               </w:rPr>
-              <w:t>Added 30sh PDI → 890 → 920sh · CB $17.72</w:t>
+              <w:t>Added 25sh AGNC → 1,410 → 1435sh · CB $11.93</w:t>
             </w:r>
           </w:p>
         </w:tc>
@@ -5791,38 +5823,38 @@
                 <w:sz w:val="16"/>
                 <w:szCs w:val="16"/>
               </w:rPr>
-              <w:t xml:space="preserve">Lisa HSA</w:t>
-            </w:r>
-          </w:p>
-        </w:tc>
-        <w:tc>
-          <w:tcPr>
-            <w:tcBorders>
-              <w:top w:val="single" w:color="E2E4E9" w:sz="1"/>
-              <w:left w:val="none" w:color="FFFFFF" w:sz="0"/>
-              <w:bottom w:val="single" w:color="E2E4E9" w:sz="1"/>
-              <w:right w:val="none" w:color="FFFFFF" w:sz="0"/>
-            </w:tcBorders>
-            <w:shd w:fill="D4EDDA" w:val="clear"/>
-            <w:vAlign w:val="center"/>
-          </w:tcPr>
-          <w:p>
-            <w:pPr>
-              <w:spacing w:after="40" w:before="40"/>
-              <w:jc w:val="left"/>
-            </w:pPr>
-            <w:r>
-              <w:rPr>
-                <w:rFonts w:ascii="Calibri" w:cs="Calibri" w:eastAsia="Calibri" w:hAnsi="Calibri"/>
-                <w:b w:val="false"/>
-                <w:bCs w:val="false"/>
-                <w:i w:val="false"/>
-                <w:iCs w:val="false"/>
-                <w:color w:val="5A5E6B"/>
-                <w:sz w:val="16"/>
-                <w:szCs w:val="16"/>
-              </w:rPr>
-              <w:t>August 14, 2026</w:t>
+              <w:t xml:space="preserve">Brad Roth IRA</w:t>
+            </w:r>
+          </w:p>
+        </w:tc>
+        <w:tc>
+          <w:tcPr>
+            <w:tcBorders>
+              <w:top w:val="single" w:color="E2E4E9" w:sz="1"/>
+              <w:left w:val="none" w:color="FFFFFF" w:sz="0"/>
+              <w:bottom w:val="single" w:color="E2E4E9" w:sz="1"/>
+              <w:right w:val="none" w:color="FFFFFF" w:sz="0"/>
+            </w:tcBorders>
+            <w:shd w:fill="D4EDDA" w:val="clear"/>
+            <w:vAlign w:val="center"/>
+          </w:tcPr>
+          <w:p>
+            <w:pPr>
+              <w:spacing w:after="40" w:before="40"/>
+              <w:jc w:val="left"/>
+            </w:pPr>
+            <w:r>
+              <w:rPr>
+                <w:rFonts w:ascii="Calibri" w:cs="Calibri" w:eastAsia="Calibri" w:hAnsi="Calibri"/>
+                <w:b w:val="false"/>
+                <w:bCs w:val="false"/>
+                <w:i w:val="false"/>
+                <w:iCs w:val="false"/>
+                <w:color w:val="5A5E6B"/>
+                <w:sz w:val="16"/>
+                <w:szCs w:val="16"/>
+              </w:rPr>
+              <w:t>August 21, 2026</w:t>
             </w:r>
           </w:p>
         </w:tc>
@@ -5886,7 +5918,7 @@
                 <w:sz w:val="17"/>
                 <w:szCs w:val="17"/>
               </w:rPr>
-              <w:t>Added 5sh PDI → 337 → 342sh · CB $18.13</w:t>
+              <w:t>Opened 75sh BCX (NEW) · CB $11.67 ⚠ auto-added</w:t>
             </w:r>
           </w:p>
         </w:tc>
@@ -5917,6 +5949,258 @@
                 <w:sz w:val="16"/>
                 <w:szCs w:val="16"/>
               </w:rPr>
+              <w:t xml:space="preserve">Lisa IRA</w:t>
+            </w:r>
+          </w:p>
+        </w:tc>
+        <w:tc>
+          <w:tcPr>
+            <w:tcBorders>
+              <w:top w:val="single" w:color="E2E4E9" w:sz="1"/>
+              <w:left w:val="none" w:color="FFFFFF" w:sz="0"/>
+              <w:bottom w:val="single" w:color="E2E4E9" w:sz="1"/>
+              <w:right w:val="none" w:color="FFFFFF" w:sz="0"/>
+            </w:tcBorders>
+            <w:shd w:fill="D4EDDA" w:val="clear"/>
+            <w:vAlign w:val="center"/>
+          </w:tcPr>
+          <w:p>
+            <w:pPr>
+              <w:spacing w:after="40" w:before="40"/>
+              <w:jc w:val="left"/>
+            </w:pPr>
+            <w:r>
+              <w:rPr>
+                <w:rFonts w:ascii="Calibri" w:cs="Calibri" w:eastAsia="Calibri" w:hAnsi="Calibri"/>
+                <w:b w:val="false"/>
+                <w:bCs w:val="false"/>
+                <w:i w:val="false"/>
+                <w:iCs w:val="false"/>
+                <w:color w:val="5A5E6B"/>
+                <w:sz w:val="16"/>
+                <w:szCs w:val="16"/>
+              </w:rPr>
+              <w:t>August 21, 2026</w:t>
+            </w:r>
+          </w:p>
+        </w:tc>
+      </w:tr>
+      <w:tr>
+        <w:tc>
+          <w:tcPr>
+            <w:tcBorders>
+              <w:top w:val="single" w:color="E2E4E9" w:sz="1"/>
+              <w:left w:val="none" w:color="FFFFFF" w:sz="0"/>
+              <w:bottom w:val="single" w:color="E2E4E9" w:sz="1"/>
+              <w:right w:val="none" w:color="FFFFFF" w:sz="0"/>
+            </w:tcBorders>
+            <w:shd w:fill="D4EDDA" w:val="clear"/>
+            <w:vAlign w:val="center"/>
+          </w:tcPr>
+          <w:p>
+            <w:pPr>
+              <w:spacing w:after="40" w:before="40"/>
+              <w:jc w:val="left"/>
+            </w:pPr>
+            <w:r>
+              <w:rPr>
+                <w:rFonts w:ascii="Calibri" w:cs="Calibri" w:eastAsia="Calibri" w:hAnsi="Calibri"/>
+                <w:b/>
+                <w:bCs/>
+                <w:i w:val="false"/>
+                <w:iCs w:val="false"/>
+                <w:color w:val="155724"/>
+                <w:sz w:val="17"/>
+                <w:szCs w:val="17"/>
+              </w:rPr>
+              <w:t xml:space="preserve">✅ Done</w:t>
+            </w:r>
+          </w:p>
+        </w:tc>
+        <w:tc>
+          <w:tcPr>
+            <w:tcBorders>
+              <w:top w:val="single" w:color="E2E4E9" w:sz="1"/>
+              <w:left w:val="none" w:color="FFFFFF" w:sz="0"/>
+              <w:bottom w:val="single" w:color="E2E4E9" w:sz="1"/>
+              <w:right w:val="none" w:color="FFFFFF" w:sz="0"/>
+            </w:tcBorders>
+            <w:shd w:fill="D4EDDA" w:val="clear"/>
+            <w:vAlign w:val="center"/>
+          </w:tcPr>
+          <w:p>
+            <w:pPr>
+              <w:spacing w:after="40" w:before="40"/>
+              <w:jc w:val="left"/>
+            </w:pPr>
+            <w:r>
+              <w:rPr>
+                <w:rFonts w:ascii="Calibri" w:cs="Calibri" w:eastAsia="Calibri" w:hAnsi="Calibri"/>
+                <w:b w:val="false"/>
+                <w:bCs w:val="false"/>
+                <w:i w:val="false"/>
+                <w:iCs w:val="false"/>
+                <w:color w:val="1F3864"/>
+                <w:sz w:val="17"/>
+                <w:szCs w:val="17"/>
+              </w:rPr>
+              <w:t>Added 30sh PDI → 890 → 920sh · CB $17.72</w:t>
+            </w:r>
+          </w:p>
+        </w:tc>
+        <w:tc>
+          <w:tcPr>
+            <w:tcBorders>
+              <w:top w:val="single" w:color="E2E4E9" w:sz="1"/>
+              <w:left w:val="none" w:color="FFFFFF" w:sz="0"/>
+              <w:bottom w:val="single" w:color="E2E4E9" w:sz="1"/>
+              <w:right w:val="none" w:color="FFFFFF" w:sz="0"/>
+            </w:tcBorders>
+            <w:shd w:fill="D4EDDA" w:val="clear"/>
+            <w:vAlign w:val="center"/>
+          </w:tcPr>
+          <w:p>
+            <w:pPr>
+              <w:spacing w:after="40" w:before="40"/>
+              <w:jc w:val="left"/>
+            </w:pPr>
+            <w:r>
+              <w:rPr>
+                <w:rFonts w:ascii="Calibri" w:cs="Calibri" w:eastAsia="Calibri" w:hAnsi="Calibri"/>
+                <w:b w:val="false"/>
+                <w:bCs w:val="false"/>
+                <w:i/>
+                <w:iCs/>
+                <w:color w:val="5A5E6B"/>
+                <w:sz w:val="16"/>
+                <w:szCs w:val="16"/>
+              </w:rPr>
+              <w:t xml:space="preserve">Lisa HSA</w:t>
+            </w:r>
+          </w:p>
+        </w:tc>
+        <w:tc>
+          <w:tcPr>
+            <w:tcBorders>
+              <w:top w:val="single" w:color="E2E4E9" w:sz="1"/>
+              <w:left w:val="none" w:color="FFFFFF" w:sz="0"/>
+              <w:bottom w:val="single" w:color="E2E4E9" w:sz="1"/>
+              <w:right w:val="none" w:color="FFFFFF" w:sz="0"/>
+            </w:tcBorders>
+            <w:shd w:fill="D4EDDA" w:val="clear"/>
+            <w:vAlign w:val="center"/>
+          </w:tcPr>
+          <w:p>
+            <w:pPr>
+              <w:spacing w:after="40" w:before="40"/>
+              <w:jc w:val="left"/>
+            </w:pPr>
+            <w:r>
+              <w:rPr>
+                <w:rFonts w:ascii="Calibri" w:cs="Calibri" w:eastAsia="Calibri" w:hAnsi="Calibri"/>
+                <w:b w:val="false"/>
+                <w:bCs w:val="false"/>
+                <w:i w:val="false"/>
+                <w:iCs w:val="false"/>
+                <w:color w:val="5A5E6B"/>
+                <w:sz w:val="16"/>
+                <w:szCs w:val="16"/>
+              </w:rPr>
+              <w:t>August 21, 2026</w:t>
+            </w:r>
+          </w:p>
+        </w:tc>
+      </w:tr>
+      <w:tr>
+        <w:tc>
+          <w:tcPr>
+            <w:tcBorders>
+              <w:top w:val="single" w:color="E2E4E9" w:sz="1"/>
+              <w:left w:val="none" w:color="FFFFFF" w:sz="0"/>
+              <w:bottom w:val="single" w:color="E2E4E9" w:sz="1"/>
+              <w:right w:val="none" w:color="FFFFFF" w:sz="0"/>
+            </w:tcBorders>
+            <w:shd w:fill="D4EDDA" w:val="clear"/>
+            <w:vAlign w:val="center"/>
+          </w:tcPr>
+          <w:p>
+            <w:pPr>
+              <w:spacing w:after="40" w:before="40"/>
+              <w:jc w:val="left"/>
+            </w:pPr>
+            <w:r>
+              <w:rPr>
+                <w:rFonts w:ascii="Calibri" w:cs="Calibri" w:eastAsia="Calibri" w:hAnsi="Calibri"/>
+                <w:b/>
+                <w:bCs/>
+                <w:i w:val="false"/>
+                <w:iCs w:val="false"/>
+                <w:color w:val="155724"/>
+                <w:sz w:val="17"/>
+                <w:szCs w:val="17"/>
+              </w:rPr>
+              <w:t xml:space="preserve">✅ Done</w:t>
+            </w:r>
+          </w:p>
+        </w:tc>
+        <w:tc>
+          <w:tcPr>
+            <w:tcBorders>
+              <w:top w:val="single" w:color="E2E4E9" w:sz="1"/>
+              <w:left w:val="none" w:color="FFFFFF" w:sz="0"/>
+              <w:bottom w:val="single" w:color="E2E4E9" w:sz="1"/>
+              <w:right w:val="none" w:color="FFFFFF" w:sz="0"/>
+            </w:tcBorders>
+            <w:shd w:fill="D4EDDA" w:val="clear"/>
+            <w:vAlign w:val="center"/>
+          </w:tcPr>
+          <w:p>
+            <w:pPr>
+              <w:spacing w:after="40" w:before="40"/>
+              <w:jc w:val="left"/>
+            </w:pPr>
+            <w:r>
+              <w:rPr>
+                <w:rFonts w:ascii="Calibri" w:cs="Calibri" w:eastAsia="Calibri" w:hAnsi="Calibri"/>
+                <w:b w:val="false"/>
+                <w:bCs w:val="false"/>
+                <w:i w:val="false"/>
+                <w:iCs w:val="false"/>
+                <w:color w:val="1F3864"/>
+                <w:sz w:val="17"/>
+                <w:szCs w:val="17"/>
+              </w:rPr>
+              <w:t>Added 5sh PDI → 337 → 342sh · CB $18.13</w:t>
+            </w:r>
+          </w:p>
+        </w:tc>
+        <w:tc>
+          <w:tcPr>
+            <w:tcBorders>
+              <w:top w:val="single" w:color="E2E4E9" w:sz="1"/>
+              <w:left w:val="none" w:color="FFFFFF" w:sz="0"/>
+              <w:bottom w:val="single" w:color="E2E4E9" w:sz="1"/>
+              <w:right w:val="none" w:color="FFFFFF" w:sz="0"/>
+            </w:tcBorders>
+            <w:shd w:fill="D4EDDA" w:val="clear"/>
+            <w:vAlign w:val="center"/>
+          </w:tcPr>
+          <w:p>
+            <w:pPr>
+              <w:spacing w:after="40" w:before="40"/>
+              <w:jc w:val="left"/>
+            </w:pPr>
+            <w:r>
+              <w:rPr>
+                <w:rFonts w:ascii="Calibri" w:cs="Calibri" w:eastAsia="Calibri" w:hAnsi="Calibri"/>
+                <w:b w:val="false"/>
+                <w:bCs w:val="false"/>
+                <w:i/>
+                <w:iCs/>
+                <w:color w:val="5A5E6B"/>
+                <w:sz w:val="16"/>
+                <w:szCs w:val="16"/>
+              </w:rPr>
               <w:t xml:space="preserve">Brad HSA</w:t>
             </w:r>
           </w:p>
@@ -5948,7 +6232,7 @@
                 <w:sz w:val="16"/>
                 <w:szCs w:val="16"/>
               </w:rPr>
-              <w:t>August 14, 2026</w:t>
+              <w:t>August 21, 2026</w:t>
             </w:r>
           </w:p>
         </w:tc>
@@ -8222,14 +8506,22 @@
             <w:vAlign w:val="center"/>
           </w:tcPr>
           <w:p>
-            <w:r/>
-            <w:r>
-              <w:rPr>
-                <w:rFonts w:ascii="Calibri" w:hAnsi="Calibri" w:eastAsia="Calibri" w:cs="Calibri"/>
-                <w:b w:val="0"/>
-                <w:sz w:val="17"/>
-              </w:rPr>
-              <w:t>🟡 Pending</w:t>
+            <w:pPr>
+              <w:spacing w:after="40" w:before="40"/>
+              <w:jc w:val="left"/>
+            </w:pPr>
+            <w:r>
+              <w:rPr>
+                <w:rFonts w:ascii="Calibri" w:cs="Calibri" w:eastAsia="Calibri" w:hAnsi="Calibri"/>
+                <w:b/>
+                <w:bCs/>
+                <w:i w:val="false"/>
+                <w:iCs w:val="false"/>
+                <w:color w:val="B8960C"/>
+                <w:sz w:val="17"/>
+                <w:szCs w:val="17"/>
+              </w:rPr>
+              <w:t xml:space="preserve">🟡 Pending</w:t>
             </w:r>
           </w:p>
         </w:tc>
@@ -8245,14 +8537,22 @@
             <w:vAlign w:val="center"/>
           </w:tcPr>
           <w:p>
-            <w:r/>
-            <w:r>
-              <w:rPr>
-                <w:rFonts w:ascii="Calibri" w:hAnsi="Calibri" w:eastAsia="Calibri" w:cs="Calibri"/>
-                <w:b w:val="0"/>
-                <w:sz w:val="17"/>
-              </w:rPr>
-              <w:t>Sign Trustmark surrender document</w:t>
+            <w:pPr>
+              <w:spacing w:after="40" w:before="40"/>
+              <w:jc w:val="left"/>
+            </w:pPr>
+            <w:r>
+              <w:rPr>
+                <w:rFonts w:ascii="Calibri" w:cs="Calibri" w:eastAsia="Calibri" w:hAnsi="Calibri"/>
+                <w:b w:val="false"/>
+                <w:bCs w:val="false"/>
+                <w:i w:val="false"/>
+                <w:iCs w:val="false"/>
+                <w:color w:val="1A1C23"/>
+                <w:sz w:val="17"/>
+                <w:szCs w:val="17"/>
+              </w:rPr>
+              <w:t xml:space="preserve">Call Trustmark — get LTC illustration</w:t>
             </w:r>
           </w:p>
         </w:tc>
@@ -8268,14 +8568,22 @@
             <w:vAlign w:val="center"/>
           </w:tcPr>
           <w:p>
-            <w:r/>
-            <w:r>
-              <w:rPr>
-                <w:rFonts w:ascii="Calibri" w:hAnsi="Calibri" w:eastAsia="Calibri" w:cs="Calibri"/>
-                <w:b w:val="0"/>
-                <w:sz w:val="16"/>
-              </w:rPr>
-              <w:t>Value confirmed ~$1,800 · surrender letter drafted</w:t>
+            <w:pPr>
+              <w:spacing w:after="40" w:before="40"/>
+              <w:jc w:val="left"/>
+            </w:pPr>
+            <w:r>
+              <w:rPr>
+                <w:rFonts w:ascii="Calibri" w:cs="Calibri" w:eastAsia="Calibri" w:hAnsi="Calibri"/>
+                <w:b w:val="false"/>
+                <w:bCs w:val="false"/>
+                <w:i/>
+                <w:iCs/>
+                <w:color w:val="5A5E6B"/>
+                <w:sz w:val="16"/>
+                <w:szCs w:val="16"/>
+              </w:rPr>
+              <w:t xml:space="preserve">Cancel saves ~$3,787/yr · self-insuring via Pillar 3</w:t>
             </w:r>
           </w:p>
         </w:tc>
@@ -8291,14 +8599,22 @@
             <w:vAlign w:val="center"/>
           </w:tcPr>
           <w:p>
-            <w:r/>
-            <w:r>
-              <w:rPr>
-                <w:rFonts w:ascii="Calibri" w:hAnsi="Calibri" w:eastAsia="Calibri" w:cs="Calibri"/>
-                <w:b w:val="0"/>
-                <w:sz w:val="16"/>
-              </w:rPr>
-              <w:t>Ready to sign</w:t>
+            <w:pPr>
+              <w:spacing w:after="40" w:before="40"/>
+              <w:jc w:val="left"/>
+            </w:pPr>
+            <w:r>
+              <w:rPr>
+                <w:rFonts w:ascii="Calibri" w:cs="Calibri" w:eastAsia="Calibri" w:hAnsi="Calibri"/>
+                <w:b w:val="false"/>
+                <w:bCs w:val="false"/>
+                <w:i w:val="false"/>
+                <w:iCs w:val="false"/>
+                <w:color w:val="5A5E6B"/>
+                <w:sz w:val="16"/>
+                <w:szCs w:val="16"/>
+              </w:rPr>
+              <w:t xml:space="preserve">This week</w:t>
             </w:r>
           </w:p>
         </w:tc>
@@ -8425,100 +8741,6 @@
                 <w:szCs w:val="16"/>
               </w:rPr>
               <w:t xml:space="preserve">Ready now</w:t>
-            </w:r>
-          </w:p>
-        </w:tc>
-      </w:tr>
-      <w:tr>
-        <w:tc>
-          <w:tcPr>
-            <w:tcBorders>
-              <w:top w:val="single" w:color="E2E4E9" w:sz="1"/>
-              <w:left w:val="none" w:color="FFFFFF" w:sz="0"/>
-              <w:bottom w:val="single" w:color="E2E4E9" w:sz="1"/>
-              <w:right w:val="none" w:color="FFFFFF" w:sz="0"/>
-            </w:tcBorders>
-            <w:shd w:fill="FFFFFF" w:val="clear"/>
-            <w:vAlign w:val="center"/>
-          </w:tcPr>
-          <w:p>
-            <w:r/>
-            <w:r>
-              <w:rPr>
-                <w:rFonts w:ascii="Calibri" w:hAnsi="Calibri" w:eastAsia="Calibri" w:cs="Calibri"/>
-                <w:b w:val="0"/>
-                <w:sz w:val="17"/>
-              </w:rPr>
-              <w:t>🟢 Planned</w:t>
-            </w:r>
-          </w:p>
-        </w:tc>
-        <w:tc>
-          <w:tcPr>
-            <w:tcBorders>
-              <w:top w:val="single" w:color="E2E4E9" w:sz="1"/>
-              <w:left w:val="none" w:color="FFFFFF" w:sz="0"/>
-              <w:bottom w:val="single" w:color="E2E4E9" w:sz="1"/>
-              <w:right w:val="none" w:color="FFFFFF" w:sz="0"/>
-            </w:tcBorders>
-            <w:shd w:fill="FFFFFF" w:val="clear"/>
-            <w:vAlign w:val="center"/>
-          </w:tcPr>
-          <w:p>
-            <w:r/>
-            <w:r>
-              <w:rPr>
-                <w:rFonts w:ascii="Calibri" w:hAnsi="Calibri" w:eastAsia="Calibri" w:cs="Calibri"/>
-                <w:b w:val="0"/>
-                <w:sz w:val="17"/>
-              </w:rPr>
-              <w:t>Reduce life insurance amounts</w:t>
-            </w:r>
-          </w:p>
-        </w:tc>
-        <w:tc>
-          <w:tcPr>
-            <w:tcBorders>
-              <w:top w:val="single" w:color="E2E4E9" w:sz="1"/>
-              <w:left w:val="none" w:color="FFFFFF" w:sz="0"/>
-              <w:bottom w:val="single" w:color="E2E4E9" w:sz="1"/>
-              <w:right w:val="none" w:color="FFFFFF" w:sz="0"/>
-            </w:tcBorders>
-            <w:shd w:fill="FFFFFF" w:val="clear"/>
-            <w:vAlign w:val="center"/>
-          </w:tcPr>
-          <w:p>
-            <w:r/>
-            <w:r>
-              <w:rPr>
-                <w:rFonts w:ascii="Calibri" w:hAnsi="Calibri" w:eastAsia="Calibri" w:cs="Calibri"/>
-                <w:b w:val="0"/>
-                <w:sz w:val="16"/>
-              </w:rPr>
-              <w:t>Oracle open enrollment · lower ongoing premium</w:t>
-            </w:r>
-          </w:p>
-        </w:tc>
-        <w:tc>
-          <w:tcPr>
-            <w:tcBorders>
-              <w:top w:val="single" w:color="E2E4E9" w:sz="1"/>
-              <w:left w:val="none" w:color="FFFFFF" w:sz="0"/>
-              <w:bottom w:val="single" w:color="E2E4E9" w:sz="1"/>
-              <w:right w:val="none" w:color="FFFFFF" w:sz="0"/>
-            </w:tcBorders>
-            <w:shd w:fill="FFFFFF" w:val="clear"/>
-            <w:vAlign w:val="center"/>
-          </w:tcPr>
-          <w:p>
-            <w:r/>
-            <w:r>
-              <w:rPr>
-                <w:rFonts w:ascii="Calibri" w:hAnsi="Calibri" w:eastAsia="Calibri" w:cs="Calibri"/>
-                <w:b w:val="0"/>
-                <w:sz w:val="16"/>
-              </w:rPr>
-              <w:t>Q4 2026 (Oracle open enrollment, year-end)</w:t>
             </w:r>
           </w:p>
         </w:tc>
@@ -9570,14 +9792,22 @@
             <w:vAlign w:val="center"/>
           </w:tcPr>
           <w:p>
-            <w:r/>
-            <w:r>
-              <w:rPr>
-                <w:rFonts w:ascii="Calibri" w:hAnsi="Calibri" w:eastAsia="Calibri" w:cs="Calibri"/>
-                <w:b w:val="0"/>
-                <w:sz w:val="16"/>
-              </w:rPr>
-              <w:t>Completed — redeployed into PTY + O (K-1 eliminated)</w:t>
+            <w:pPr>
+              <w:spacing w:after="40" w:before="40"/>
+              <w:jc w:val="left"/>
+            </w:pPr>
+            <w:r>
+              <w:rPr>
+                <w:rFonts w:ascii="Calibri" w:cs="Calibri" w:eastAsia="Calibri" w:hAnsi="Calibri"/>
+                <w:b w:val="false"/>
+                <w:bCs w:val="false"/>
+                <w:i/>
+                <w:iCs/>
+                <w:color w:val="5A5E6B"/>
+                <w:sz w:val="16"/>
+                <w:szCs w:val="16"/>
+              </w:rPr>
+              <w:t xml:space="preserve">Currently in Brad IRA · move at year end</w:t>
             </w:r>
           </w:p>
         </w:tc>
@@ -10185,30 +10415,6 @@
             <w:vAlign w:val="center"/>
           </w:tcPr>
           <w:p>
-            <w:r/>
-            <w:r>
-              <w:rPr>
-                <w:rFonts w:ascii="Calibri" w:hAnsi="Calibri"/>
-                <w:b/>
-                <w:sz w:val="18"/>
-              </w:rPr>
-              <w:t>Income Summary — August 20, 2026</w:t>
-            </w:r>
-          </w:p>
-        </w:tc>
-        <w:tc>
-          <w:tcPr>
-            <w:tcW w:type="dxa" w:w="1500"/>
-            <w:tcBorders>
-              <w:top w:val="none" w:color="FFFFFF" w:sz="0"/>
-              <w:left w:val="none" w:color="FFFFFF" w:sz="0"/>
-              <w:bottom w:val="none" w:color="FFFFFF" w:sz="0"/>
-              <w:right w:val="none" w:color="FFFFFF" w:sz="0"/>
-            </w:tcBorders>
-            <w:shd w:fill="1F3864" w:val="clear"/>
-            <w:vAlign w:val="center"/>
-          </w:tcPr>
-          <w:p>
             <w:pPr>
               <w:spacing w:after="60" w:before="60"/>
             </w:pPr>
@@ -10223,7 +10429,7 @@
                 <w:sz w:val="16"/>
                 <w:szCs w:val="16"/>
               </w:rPr>
-              <w:t xml:space="preserve">Annual</w:t>
+              <w:t>Income Summary — August 21, 2026</w:t>
             </w:r>
           </w:p>
         </w:tc>
@@ -10254,13 +10460,13 @@
                 <w:sz w:val="16"/>
                 <w:szCs w:val="16"/>
               </w:rPr>
-              <w:t xml:space="preserve">Monthly</w:t>
-            </w:r>
-          </w:p>
-        </w:tc>
-        <w:tc>
-          <w:tcPr>
-            <w:tcW w:type="dxa" w:w="2500"/>
+              <w:t xml:space="preserve">Annual</w:t>
+            </w:r>
+          </w:p>
+        </w:tc>
+        <w:tc>
+          <w:tcPr>
+            <w:tcW w:type="dxa" w:w="1500"/>
             <w:tcBorders>
               <w:top w:val="none" w:color="FFFFFF" w:sz="0"/>
               <w:left w:val="none" w:color="FFFFFF" w:sz="0"/>
@@ -10285,6 +10491,37 @@
                 <w:sz w:val="16"/>
                 <w:szCs w:val="16"/>
               </w:rPr>
+              <w:t xml:space="preserve">Monthly</w:t>
+            </w:r>
+          </w:p>
+        </w:tc>
+        <w:tc>
+          <w:tcPr>
+            <w:tcW w:type="dxa" w:w="2500"/>
+            <w:tcBorders>
+              <w:top w:val="none" w:color="FFFFFF" w:sz="0"/>
+              <w:left w:val="none" w:color="FFFFFF" w:sz="0"/>
+              <w:bottom w:val="none" w:color="FFFFFF" w:sz="0"/>
+              <w:right w:val="none" w:color="FFFFFF" w:sz="0"/>
+            </w:tcBorders>
+            <w:shd w:fill="1F3864" w:val="clear"/>
+            <w:vAlign w:val="center"/>
+          </w:tcPr>
+          <w:p>
+            <w:pPr>
+              <w:spacing w:after="60" w:before="60"/>
+            </w:pPr>
+            <w:r>
+              <w:rPr>
+                <w:rFonts w:ascii="Calibri" w:cs="Calibri" w:eastAsia="Calibri" w:hAnsi="Calibri"/>
+                <w:b/>
+                <w:bCs/>
+                <w:caps/>
+                <w:color w:val="FFFFFF"/>
+                <w:spacing w:val="20"/>
+                <w:sz w:val="16"/>
+                <w:szCs w:val="16"/>
+              </w:rPr>
               <w:t xml:space="preserve">Status</w:t>
             </w:r>
           </w:p>
@@ -10334,14 +10571,22 @@
             <w:vAlign w:val="center"/>
           </w:tcPr>
           <w:p>
-            <w:r/>
-            <w:r>
-              <w:rPr>
-                <w:rFonts w:ascii="Calibri" w:hAnsi="Calibri"/>
-                <w:b w:val="0"/>
+            <w:pPr>
+              <w:spacing w:after="40" w:before="40"/>
+              <w:jc w:val="left"/>
+            </w:pPr>
+            <w:r>
+              <w:rPr>
+                <w:rFonts w:ascii="Calibri" w:cs="Calibri" w:eastAsia="Calibri" w:hAnsi="Calibri"/>
+                <w:b/>
+                <w:bCs/>
+                <w:i w:val="false"/>
+                <w:iCs w:val="false"/>
+                <w:color w:val="0D6B52"/>
                 <w:sz w:val="18"/>
-              </w:rPr>
-              <w:t>$82,168</w:t>
+                <w:szCs w:val="18"/>
+              </w:rPr>
+              <w:t>$82,171</w:t>
             </w:r>
           </w:p>
         </w:tc>
@@ -10357,14 +10602,22 @@
             <w:vAlign w:val="center"/>
           </w:tcPr>
           <w:p>
-            <w:r/>
-            <w:r>
-              <w:rPr>
-                <w:rFonts w:ascii="Calibri" w:hAnsi="Calibri"/>
-                <w:b w:val="0"/>
+            <w:pPr>
+              <w:spacing w:after="40" w:before="40"/>
+              <w:jc w:val="left"/>
+            </w:pPr>
+            <w:r>
+              <w:rPr>
+                <w:rFonts w:ascii="Calibri" w:cs="Calibri" w:eastAsia="Calibri" w:hAnsi="Calibri"/>
+                <w:b/>
+                <w:bCs/>
+                <w:i w:val="false"/>
+                <w:iCs w:val="false"/>
+                <w:color w:val="0D6B52"/>
                 <w:sz w:val="18"/>
-              </w:rPr>
-              <w:t>$6,847</w:t>
+                <w:szCs w:val="18"/>
+              </w:rPr>
+              <w:t>$6,848</w:t>
             </w:r>
           </w:p>
         </w:tc>
@@ -10570,14 +10823,22 @@
             <w:vAlign w:val="center"/>
           </w:tcPr>
           <w:p>
-            <w:r/>
-            <w:r>
-              <w:rPr>
-                <w:rFonts w:ascii="Calibri" w:hAnsi="Calibri"/>
-                <w:b w:val="0"/>
+            <w:pPr>
+              <w:spacing w:after="40" w:before="40"/>
+              <w:jc w:val="left"/>
+            </w:pPr>
+            <w:r>
+              <w:rPr>
+                <w:rFonts w:ascii="Calibri" w:cs="Calibri" w:eastAsia="Calibri" w:hAnsi="Calibri"/>
+                <w:b/>
+                <w:bCs/>
+                <w:i w:val="false"/>
+                <w:iCs w:val="false"/>
+                <w:color w:val="0D6B52"/>
                 <w:sz w:val="18"/>
-              </w:rPr>
-              <w:t>~$83,438</w:t>
+                <w:szCs w:val="18"/>
+              </w:rPr>
+              <w:t>~$84,552</w:t>
             </w:r>
           </w:p>
         </w:tc>
@@ -10593,14 +10854,22 @@
             <w:vAlign w:val="center"/>
           </w:tcPr>
           <w:p>
-            <w:r/>
-            <w:r>
-              <w:rPr>
-                <w:rFonts w:ascii="Calibri" w:hAnsi="Calibri"/>
-                <w:b w:val="0"/>
+            <w:pPr>
+              <w:spacing w:after="40" w:before="40"/>
+              <w:jc w:val="left"/>
+            </w:pPr>
+            <w:r>
+              <w:rPr>
+                <w:rFonts w:ascii="Calibri" w:cs="Calibri" w:eastAsia="Calibri" w:hAnsi="Calibri"/>
+                <w:b/>
+                <w:bCs/>
+                <w:i w:val="false"/>
+                <w:iCs w:val="false"/>
+                <w:color w:val="0D6B52"/>
                 <w:sz w:val="18"/>
-              </w:rPr>
-              <w:t>$6,953</w:t>
+                <w:szCs w:val="18"/>
+              </w:rPr>
+              <w:t>$7,046</w:t>
             </w:r>
           </w:p>
         </w:tc>
@@ -10616,14 +10885,22 @@
             <w:vAlign w:val="center"/>
           </w:tcPr>
           <w:p>
-            <w:r/>
-            <w:r>
-              <w:rPr>
-                <w:rFonts w:ascii="Calibri" w:hAnsi="Calibri"/>
-                <w:b w:val="0"/>
+            <w:pPr>
+              <w:spacing w:after="40" w:before="40"/>
+              <w:jc w:val="left"/>
+            </w:pPr>
+            <w:r>
+              <w:rPr>
+                <w:rFonts w:ascii="Calibri" w:cs="Calibri" w:eastAsia="Calibri" w:hAnsi="Calibri"/>
+                <w:b/>
+                <w:bCs/>
+                <w:i w:val="false"/>
+                <w:iCs w:val="false"/>
+                <w:color w:val="0D6B52"/>
                 <w:sz w:val="18"/>
-              </w:rPr>
-              <w:t>All-in income $92,000 exceeds target ✅</w:t>
+                <w:szCs w:val="18"/>
+              </w:rPr>
+              <w:t xml:space="preserve">All-in income $93,114 exceeds target ✅</w:t>
             </w:r>
           </w:p>
         </w:tc>

</xml_diff>

<commit_message>
Refresh Aug 22 2026: +5sh EPD Joint
</commit_message>
<xml_diff>
--- a/docs/templates/Kitchen_Action_Items.docx
+++ b/docs/templates/Kitchen_Action_Items.docx
@@ -45,7 +45,7 @@
           <w:sz w:val="17"/>
           <w:szCs w:val="17"/>
         </w:rPr>
-        <w:t>As of August 21, 2026  ·  Three-Pillar Retirement Strategy</w:t>
+        <w:t>As of August 22, 2026  ·  Three-Pillar Retirement Strategy</w:t>
       </w:r>
     </w:p>
     <w:p>
@@ -454,6 +454,80 @@
             <w:vAlign w:val="center"/>
           </w:tcPr>
           <w:p>
+            <w:r/>
+            <w:r>
+              <w:t>✅ Done</w:t>
+            </w:r>
+          </w:p>
+        </w:tc>
+        <w:tc>
+          <w:tcPr>
+            <w:tcBorders>
+              <w:top w:val="single" w:color="E2E4E9" w:sz="1"/>
+              <w:left w:val="none" w:color="FFFFFF" w:sz="0"/>
+              <w:bottom w:val="single" w:color="E2E4E9" w:sz="1"/>
+              <w:right w:val="none" w:color="FFFFFF" w:sz="0"/>
+            </w:tcBorders>
+            <w:shd w:fill="D4EDDA" w:val="clear"/>
+            <w:vAlign w:val="center"/>
+          </w:tcPr>
+          <w:p>
+            <w:r/>
+            <w:r>
+              <w:t>Added 5sh EPD → 385 → 390sh</w:t>
+            </w:r>
+          </w:p>
+        </w:tc>
+        <w:tc>
+          <w:tcPr>
+            <w:tcBorders>
+              <w:top w:val="single" w:color="E2E4E9" w:sz="1"/>
+              <w:left w:val="none" w:color="FFFFFF" w:sz="0"/>
+              <w:bottom w:val="single" w:color="E2E4E9" w:sz="1"/>
+              <w:right w:val="none" w:color="FFFFFF" w:sz="0"/>
+            </w:tcBorders>
+            <w:shd w:fill="D4EDDA" w:val="clear"/>
+            <w:vAlign w:val="center"/>
+          </w:tcPr>
+          <w:p>
+            <w:r/>
+            <w:r>
+              <w:t>Joint</w:t>
+            </w:r>
+          </w:p>
+        </w:tc>
+        <w:tc>
+          <w:tcPr>
+            <w:tcBorders>
+              <w:top w:val="single" w:color="E2E4E9" w:sz="1"/>
+              <w:left w:val="none" w:color="FFFFFF" w:sz="0"/>
+              <w:bottom w:val="single" w:color="E2E4E9" w:sz="1"/>
+              <w:right w:val="none" w:color="FFFFFF" w:sz="0"/>
+            </w:tcBorders>
+            <w:shd w:fill="D4EDDA" w:val="clear"/>
+            <w:vAlign w:val="center"/>
+          </w:tcPr>
+          <w:p>
+            <w:r/>
+            <w:r>
+              <w:t>August 22, 2026</w:t>
+            </w:r>
+          </w:p>
+        </w:tc>
+      </w:tr>
+      <w:tr>
+        <w:tc>
+          <w:tcPr>
+            <w:tcBorders>
+              <w:top w:val="single" w:color="E2E4E9" w:sz="1"/>
+              <w:left w:val="none" w:color="FFFFFF" w:sz="0"/>
+              <w:bottom w:val="single" w:color="E2E4E9" w:sz="1"/>
+              <w:right w:val="none" w:color="FFFFFF" w:sz="0"/>
+            </w:tcBorders>
+            <w:shd w:fill="D4EDDA" w:val="clear"/>
+            <w:vAlign w:val="center"/>
+          </w:tcPr>
+          <w:p>
             <w:pPr>
               <w:spacing w:after="40" w:before="40"/>
               <w:jc w:val="left"/>
@@ -10429,7 +10503,7 @@
                 <w:sz w:val="16"/>
                 <w:szCs w:val="16"/>
               </w:rPr>
-              <w:t>Income Summary — August 21, 2026</w:t>
+              <w:t>Income Summary — August 22, 2026</w:t>
             </w:r>
           </w:p>
         </w:tc>
@@ -10571,22 +10645,12 @@
             <w:vAlign w:val="center"/>
           </w:tcPr>
           <w:p>
-            <w:pPr>
-              <w:spacing w:after="40" w:before="40"/>
-              <w:jc w:val="left"/>
-            </w:pPr>
-            <w:r>
-              <w:rPr>
-                <w:rFonts w:ascii="Calibri" w:cs="Calibri" w:eastAsia="Calibri" w:hAnsi="Calibri"/>
+            <w:r/>
+            <w:r>
+              <w:rPr>
                 <w:b/>
-                <w:bCs/>
-                <w:i w:val="false"/>
-                <w:iCs w:val="false"/>
-                <w:color w:val="0D6B52"/>
-                <w:sz w:val="18"/>
-                <w:szCs w:val="18"/>
-              </w:rPr>
-              <w:t>$82,171</w:t>
+              </w:rPr>
+              <w:t>$82,182</w:t>
             </w:r>
           </w:p>
         </w:tc>
@@ -10602,20 +10666,10 @@
             <w:vAlign w:val="center"/>
           </w:tcPr>
           <w:p>
-            <w:pPr>
-              <w:spacing w:after="40" w:before="40"/>
-              <w:jc w:val="left"/>
-            </w:pPr>
-            <w:r>
-              <w:rPr>
-                <w:rFonts w:ascii="Calibri" w:cs="Calibri" w:eastAsia="Calibri" w:hAnsi="Calibri"/>
+            <w:r/>
+            <w:r>
+              <w:rPr>
                 <w:b/>
-                <w:bCs/>
-                <w:i w:val="false"/>
-                <w:iCs w:val="false"/>
-                <w:color w:val="0D6B52"/>
-                <w:sz w:val="18"/>
-                <w:szCs w:val="18"/>
               </w:rPr>
               <w:t>$6,848</w:t>
             </w:r>
@@ -10823,22 +10877,12 @@
             <w:vAlign w:val="center"/>
           </w:tcPr>
           <w:p>
-            <w:pPr>
-              <w:spacing w:after="40" w:before="40"/>
-              <w:jc w:val="left"/>
-            </w:pPr>
-            <w:r>
-              <w:rPr>
-                <w:rFonts w:ascii="Calibri" w:cs="Calibri" w:eastAsia="Calibri" w:hAnsi="Calibri"/>
+            <w:r/>
+            <w:r>
+              <w:rPr>
                 <w:b/>
-                <w:bCs/>
-                <w:i w:val="false"/>
-                <w:iCs w:val="false"/>
-                <w:color w:val="0D6B52"/>
-                <w:sz w:val="18"/>
-                <w:szCs w:val="18"/>
-              </w:rPr>
-              <w:t>~$84,552</w:t>
+              </w:rPr>
+              <w:t>~$84,563</w:t>
             </w:r>
           </w:p>
         </w:tc>
@@ -10854,22 +10898,12 @@
             <w:vAlign w:val="center"/>
           </w:tcPr>
           <w:p>
-            <w:pPr>
-              <w:spacing w:after="40" w:before="40"/>
-              <w:jc w:val="left"/>
-            </w:pPr>
-            <w:r>
-              <w:rPr>
-                <w:rFonts w:ascii="Calibri" w:cs="Calibri" w:eastAsia="Calibri" w:hAnsi="Calibri"/>
+            <w:r/>
+            <w:r>
+              <w:rPr>
                 <w:b/>
-                <w:bCs/>
-                <w:i w:val="false"/>
-                <w:iCs w:val="false"/>
-                <w:color w:val="0D6B52"/>
-                <w:sz w:val="18"/>
-                <w:szCs w:val="18"/>
-              </w:rPr>
-              <w:t>$7,046</w:t>
+              </w:rPr>
+              <w:t>$7,047</w:t>
             </w:r>
           </w:p>
         </w:tc>

</xml_diff>